<commit_message>
templates: rebuild the AT2 deployment report after the Pass A cuts
Co-Authored-By: Claude Opus 5 (1M context) <noreply@anthropic.com>
</commit_message>
<xml_diff>
--- a/public/templates/AT2-Deployment-Report-Template.docx
+++ b/public/templates/AT2-Deployment-Report-Template.docx
@@ -513,7 +513,7 @@
                 <w:color w:val="1F5A5C"/>
                 <w:sz w:val="20"/>
               </w:rPr>
-              <w:t>Complete every section.</w:t>
+              <w:t>Complete every section that asks you for a response.</w:t>
             </w:r>
             <w:r>
               <w:rPr>
@@ -530,6 +530,23 @@
                 <w:color w:val="1F5A5C"/>
                 <w:sz w:val="20"/>
               </w:rPr>
+              <w:t>Two sections are supplied.</w:t>
+            </w:r>
+            <w:r>
+              <w:rPr>
+                <w:color w:val="1F2329"/>
+                <w:sz w:val="20"/>
+              </w:rPr>
+              <w:t xml:space="preserve">  §2 and §3 are already written for you and are part of your report. Leave them as they are, and delete the violet note above each before you submit.</w:t>
+            </w:r>
+          </w:p>
+          <w:p>
+            <w:r>
+              <w:rPr>
+                <w:b/>
+                <w:color w:val="1F5A5C"/>
+                <w:sz w:val="20"/>
+              </w:rPr>
               <w:t>Cross-reference your evidence.</w:t>
             </w:r>
             <w:r>
@@ -537,7 +554,7 @@
                 <w:color w:val="1F2329"/>
                 <w:sz w:val="20"/>
               </w:rPr>
-              <w:t xml:space="preserve">  The build narrative and testing sections reference the screenshots and configuration exports captured in the appendices.</w:t>
+              <w:t xml:space="preserve">  The build narrative and testing sections reference the screenshots and test evidence captured in the appendices.</w:t>
             </w:r>
           </w:p>
         </w:tc>
@@ -585,36 +602,6 @@
         <w:pStyle w:val="Heading1"/>
       </w:pPr>
       <w:r>
-        <w:t>1. Executive Summary</w:t>
-      </w:r>
-    </w:p>
-    <w:p>
-      <w:pPr>
-        <w:spacing w:after="120"/>
-      </w:pPr>
-      <w:r>
-        <w:rPr>
-          <w:i/>
-          <w:color w:val="6B6660"/>
-          <w:sz w:val="19"/>
-        </w:rPr>
-        <w:t>Write this last. A ≤ 1-page summary the reader sees first: what was deployed; the region/AZ footprint; the 2–3 highlights; and any limitations or items deferred to a later phase. ~250–400 words.</w:t>
-      </w:r>
-    </w:p>
-    <w:p>
-      <w:r>
-        <w:rPr>
-          <w:i/>
-          <w:color w:val="6B6660"/>
-        </w:rPr>
-        <w:t>[ Write your response here ]</w:t>
-      </w:r>
-    </w:p>
-    <w:p>
-      <w:pPr>
-        <w:pStyle w:val="Heading1"/>
-      </w:pPr>
-      <w:r>
         <w:t>2. Engagement Context</w:t>
       </w:r>
     </w:p>
@@ -625,19 +612,34 @@
       <w:r>
         <w:rPr>
           <w:i/>
-          <w:color w:val="6B6660"/>
-          <w:sz w:val="19"/>
+          <w:color w:val="6A3EA1"/>
+          <w:sz w:val="18"/>
         </w:rPr>
-        <w:t>Brief context for the reader (≤ ½ page): the strategic/prior work this deployment builds on (the approved business case and the design being implemented), your role, and the scope hand-off to any later phase.</w:t>
+        <w:t>Supplied — this section is already written for you. It is part of your report: leave the text below as it is. Delete this note before you submit.</w:t>
       </w:r>
     </w:p>
     <w:p>
       <w:r>
         <w:rPr>
-          <w:i/>
-          <w:color w:val="6B6660"/>
+          <w:sz w:val="21"/>
         </w:rPr>
-        <w:t>[ Write your response here ]</w:t>
+        <w:t>This deployment is the foundation-build phase of the YAT College Learning Management System (LMS) migration to AWS, carried out by MTS under the engagement agreed following the LMS Replacement Business Case. The board approved the action plan set out in that business case, and this phase implements the first stage of it.</w:t>
+      </w:r>
+    </w:p>
+    <w:p>
+      <w:r>
+        <w:rPr>
+          <w:sz w:val="21"/>
+        </w:rPr>
+        <w:t>MTS Senior Architecture and YAT IT subsequently produced the YAT LMS Cloud Architecture — Baseline Design, approved by Pat Lin (MTS Senior Consultant) and Sam Walker (YAT IT Manager). That design is the specification this deployment implements; where it leaves a decision to the implementer, the decision and its rationale are recorded in §5.</w:t>
+      </w:r>
+    </w:p>
+    <w:p>
+      <w:r>
+        <w:rPr>
+          <w:sz w:val="21"/>
+        </w:rPr>
+        <w:t>On completion the infrastructure is handed to YAT in-house IT, who are responsible for installing the LMS application, migrating the database, and running the cutover. Hardening the environment for high availability is a separate, later phase.</w:t>
       </w:r>
     </w:p>
     <w:p>
@@ -655,19 +657,232 @@
       <w:r>
         <w:rPr>
           <w:i/>
-          <w:color w:val="6B6660"/>
-          <w:sz w:val="19"/>
+          <w:color w:val="6A3EA1"/>
+          <w:sz w:val="18"/>
         </w:rPr>
-        <w:t>What is included in this deployment and what is deferred (≤ ½ page). Restate from the approved design in your own words: the in-scope components, and what is out of scope / deferred to a later phase.</w:t>
+        <w:t>Supplied — this section is already written for you. It is part of your report: leave the text below as it is. Delete this note before you submit.</w:t>
       </w:r>
     </w:p>
     <w:p>
       <w:r>
         <w:rPr>
-          <w:i/>
-          <w:color w:val="6B6660"/>
+          <w:sz w:val="21"/>
         </w:rPr>
-        <w:t>[ Write your response here ]</w:t>
+        <w:t>In scope of this deployment:</w:t>
+      </w:r>
+    </w:p>
+    <w:p>
+      <w:pPr>
+        <w:pStyle w:val="ListBullet"/>
+      </w:pPr>
+      <w:r>
+        <w:rPr>
+          <w:sz w:val="21"/>
+        </w:rPr>
+        <w:t>Identity and access management — groups, users, MFA enforcement and instance roles</w:t>
+      </w:r>
+    </w:p>
+    <w:p>
+      <w:pPr>
+        <w:pStyle w:val="ListBullet"/>
+      </w:pPr>
+      <w:r>
+        <w:rPr>
+          <w:sz w:val="21"/>
+        </w:rPr>
+        <w:t>Network topology — the VPC, its subnets, gateways and route tables</w:t>
+      </w:r>
+    </w:p>
+    <w:p>
+      <w:pPr>
+        <w:pStyle w:val="ListBullet"/>
+      </w:pPr>
+      <w:r>
+        <w:rPr>
+          <w:sz w:val="21"/>
+        </w:rPr>
+        <w:t>Compute — the launch template, EC2 instances and the Auto Scaling group</w:t>
+      </w:r>
+    </w:p>
+    <w:p>
+      <w:pPr>
+        <w:pStyle w:val="ListBullet"/>
+      </w:pPr>
+      <w:r>
+        <w:rPr>
+          <w:sz w:val="21"/>
+        </w:rPr>
+        <w:t>Load balancing — the application load balancer, its target group and listener</w:t>
+      </w:r>
+    </w:p>
+    <w:p>
+      <w:pPr>
+        <w:pStyle w:val="ListBullet"/>
+      </w:pPr>
+      <w:r>
+        <w:rPr>
+          <w:sz w:val="21"/>
+        </w:rPr>
+        <w:t>Database — the managed relational database instance</w:t>
+      </w:r>
+    </w:p>
+    <w:p>
+      <w:pPr>
+        <w:pStyle w:val="ListBullet"/>
+      </w:pPr>
+      <w:r>
+        <w:rPr>
+          <w:sz w:val="21"/>
+        </w:rPr>
+        <w:t>Storage — the EBS volumes and S3 buckets, with encryption and public-access settings</w:t>
+      </w:r>
+    </w:p>
+    <w:p>
+      <w:pPr>
+        <w:pStyle w:val="ListBullet"/>
+      </w:pPr>
+      <w:r>
+        <w:rPr>
+          <w:sz w:val="21"/>
+        </w:rPr>
+        <w:t>Security — the tiered security-group model and encryption in transit and at rest</w:t>
+      </w:r>
+    </w:p>
+    <w:p>
+      <w:pPr>
+        <w:pStyle w:val="ListBullet"/>
+      </w:pPr>
+      <w:r>
+        <w:rPr>
+          <w:sz w:val="21"/>
+        </w:rPr>
+        <w:t>Monitoring — the baseline alarm set</w:t>
+      </w:r>
+    </w:p>
+    <w:p>
+      <w:r>
+        <w:rPr>
+          <w:sz w:val="21"/>
+        </w:rPr>
+        <w:t>Deferred to the follow-on high-availability phase:</w:t>
+      </w:r>
+    </w:p>
+    <w:p>
+      <w:pPr>
+        <w:pStyle w:val="ListBullet"/>
+      </w:pPr>
+      <w:r>
+        <w:rPr>
+          <w:sz w:val="21"/>
+        </w:rPr>
+        <w:t>Multi-availability-zone database deployment</w:t>
+      </w:r>
+    </w:p>
+    <w:p>
+      <w:pPr>
+        <w:pStyle w:val="ListBullet"/>
+      </w:pPr>
+      <w:r>
+        <w:rPr>
+          <w:sz w:val="21"/>
+        </w:rPr>
+        <w:t>Resilience across availability zones</w:t>
+      </w:r>
+    </w:p>
+    <w:p>
+      <w:pPr>
+        <w:pStyle w:val="ListBullet"/>
+      </w:pPr>
+      <w:r>
+        <w:rPr>
+          <w:sz w:val="21"/>
+        </w:rPr>
+        <w:t>Failure and resize simulation, and the availability measurement that goes with it</w:t>
+      </w:r>
+    </w:p>
+    <w:p>
+      <w:pPr>
+        <w:pStyle w:val="ListBullet"/>
+      </w:pPr>
+      <w:r>
+        <w:rPr>
+          <w:sz w:val="21"/>
+        </w:rPr>
+        <w:t>Cross-Region backup and replication</w:t>
+      </w:r>
+    </w:p>
+    <w:p>
+      <w:pPr>
+        <w:pStyle w:val="ListBullet"/>
+      </w:pPr>
+      <w:r>
+        <w:rPr>
+          <w:sz w:val="21"/>
+        </w:rPr>
+        <w:t>Disaster-recovery runbooks</w:t>
+      </w:r>
+    </w:p>
+    <w:p>
+      <w:pPr>
+        <w:pStyle w:val="ListBullet"/>
+      </w:pPr>
+      <w:r>
+        <w:rPr>
+          <w:sz w:val="21"/>
+        </w:rPr>
+        <w:t>The high-availability-tuned monitoring set</w:t>
+      </w:r>
+    </w:p>
+    <w:p>
+      <w:r>
+        <w:rPr>
+          <w:sz w:val="21"/>
+        </w:rPr>
+        <w:t>Outside the MTS engagement entirely — YAT in-house IT's responsibility:</w:t>
+      </w:r>
+    </w:p>
+    <w:p>
+      <w:pPr>
+        <w:pStyle w:val="ListBullet"/>
+      </w:pPr>
+      <w:r>
+        <w:rPr>
+          <w:sz w:val="21"/>
+        </w:rPr>
+        <w:t>LMS application installation on the infrastructure built here</w:t>
+      </w:r>
+    </w:p>
+    <w:p>
+      <w:pPr>
+        <w:pStyle w:val="ListBullet"/>
+      </w:pPr>
+      <w:r>
+        <w:rPr>
+          <w:sz w:val="21"/>
+        </w:rPr>
+        <w:t>Migration of the existing database content</w:t>
+      </w:r>
+    </w:p>
+    <w:p>
+      <w:pPr>
+        <w:pStyle w:val="ListBullet"/>
+      </w:pPr>
+      <w:r>
+        <w:rPr>
+          <w:sz w:val="21"/>
+        </w:rPr>
+        <w:t>Cutover from the legacy environment, and the change management around it</w:t>
+      </w:r>
+    </w:p>
+    <w:p>
+      <w:pPr>
+        <w:pStyle w:val="ListBullet"/>
+      </w:pPr>
+      <w:r>
+        <w:rPr>
+          <w:sz w:val="21"/>
+        </w:rPr>
+        <w:t>Ongoing application support after handover</w:t>
       </w:r>
     </w:p>
     <w:p>
@@ -688,7 +903,7 @@
           <w:color w:val="6B6660"/>
           <w:sz w:val="19"/>
         </w:rPr>
-        <w:t>A layer-by-layer account of what was built. For each layer, write a short narrative of what you stood up, and cross-reference the Appendix A screenshots and Appendix B configuration exports.</w:t>
+        <w:t>A layer-by-layer account of what was built. For each layer, write a short narrative of what you stood up, and cross-reference the Appendix A screenshots.</w:t>
       </w:r>
     </w:p>
     <w:p>
@@ -709,7 +924,7 @@
           <w:color w:val="6B6660"/>
           <w:sz w:val="19"/>
         </w:rPr>
-        <w:t>Cover: account access, groups/users/roles, MFA, instance profiles. Cross-reference the relevant Appendix A screenshots and Appendix B exports.</w:t>
+        <w:t>Cover: account access, groups/users/roles, MFA, instance profiles. Cross-reference the relevant Appendix A screenshots.</w:t>
       </w:r>
     </w:p>
     <w:p>
@@ -739,7 +954,7 @@
           <w:color w:val="6B6660"/>
           <w:sz w:val="19"/>
         </w:rPr>
-        <w:t>Cover: VPC, subnets, gateways, route tables. Cross-reference the relevant Appendix A screenshots and Appendix B exports.</w:t>
+        <w:t>Cover: VPC, subnets, gateways, route tables. Cross-reference the relevant Appendix A screenshots.</w:t>
       </w:r>
     </w:p>
     <w:p>
@@ -769,7 +984,7 @@
           <w:color w:val="6B6660"/>
           <w:sz w:val="19"/>
         </w:rPr>
-        <w:t>Cover: launch template, instance type + why, ASG min/desired/max + scaling policy. Cross-reference the relevant Appendix A screenshots and Appendix B exports.</w:t>
+        <w:t>Cover: launch template, instance type + why, ASG min/desired/max + scaling policy. Cross-reference the relevant Appendix A screenshots.</w:t>
       </w:r>
     </w:p>
     <w:p>
@@ -799,7 +1014,7 @@
           <w:color w:val="6B6660"/>
           <w:sz w:val="19"/>
         </w:rPr>
-        <w:t>Cover: the load balancer, target group, listener, health check. Cross-reference the relevant Appendix A screenshots and Appendix B exports.</w:t>
+        <w:t>Cover: the load balancer, target group, listener, health check. Cross-reference the relevant Appendix A screenshots.</w:t>
       </w:r>
     </w:p>
     <w:p>
@@ -829,7 +1044,7 @@
           <w:color w:val="6B6660"/>
           <w:sz w:val="19"/>
         </w:rPr>
-        <w:t>Cover: instance class + why, engine version, storage, encryption, backups. Cross-reference the relevant Appendix A screenshots and Appendix B exports.</w:t>
+        <w:t>Cover: instance class + why, engine version, storage, encryption, backups. Cross-reference the relevant Appendix A screenshots.</w:t>
       </w:r>
     </w:p>
     <w:p>
@@ -859,7 +1074,7 @@
           <w:color w:val="6B6660"/>
           <w:sz w:val="19"/>
         </w:rPr>
-        <w:t>Cover: EBS volumes, S3 buckets, encryption, public-access settings. Cross-reference the relevant Appendix A screenshots and Appendix B exports.</w:t>
+        <w:t>Cover: EBS volumes, S3 buckets, encryption, public-access settings. Cross-reference the relevant Appendix A screenshots.</w:t>
       </w:r>
     </w:p>
     <w:p>
@@ -889,7 +1104,7 @@
           <w:color w:val="6B6660"/>
           <w:sz w:val="19"/>
         </w:rPr>
-        <w:t>Cover: the tiered security-group model, encryption in transit + at rest. Cross-reference the relevant Appendix A screenshots and Appendix B exports.</w:t>
+        <w:t>Cover: the tiered security-group model, encryption in transit + at rest. Cross-reference the relevant Appendix A screenshots.</w:t>
       </w:r>
     </w:p>
     <w:p>
@@ -919,7 +1134,7 @@
           <w:color w:val="6B6660"/>
           <w:sz w:val="19"/>
         </w:rPr>
-        <w:t>Cover: the baseline CloudWatch alarms and thresholds. Cross-reference the relevant Appendix A screenshots and Appendix B exports.</w:t>
+        <w:t>Cover: the baseline CloudWatch alarms and thresholds. Cross-reference the relevant Appendix A screenshots.</w:t>
       </w:r>
     </w:p>
     <w:p>
@@ -2444,69 +2659,6 @@
               <w:rPr>
                 <w:sz w:val="19"/>
               </w:rPr>
-              <w:t>Configuration exports (Appendix B)</w:t>
-            </w:r>
-          </w:p>
-        </w:tc>
-        <w:tc>
-          <w:tcPr>
-            <w:tcW w:type="dxa" w:w="2835"/>
-            <w:tcBorders>
-              <w:top w:val="single" w:sz="4" w:space="0" w:color="E4DED3"/>
-              <w:left w:val="single" w:sz="4" w:space="0" w:color="E4DED3"/>
-              <w:bottom w:val="single" w:sz="4" w:space="0" w:color="E4DED3"/>
-              <w:right w:val="single" w:sz="4" w:space="0" w:color="E4DED3"/>
-            </w:tcBorders>
-          </w:tcPr>
-          <w:p>
-            <w:r>
-              <w:rPr>
-                <w:i/>
-                <w:color w:val="6B6660"/>
-                <w:sz w:val="19"/>
-              </w:rPr>
-              <w:t>[ … ]</w:t>
-            </w:r>
-          </w:p>
-        </w:tc>
-        <w:tc>
-          <w:tcPr>
-            <w:tcW w:type="dxa" w:w="2268"/>
-            <w:tcBorders>
-              <w:top w:val="single" w:sz="4" w:space="0" w:color="E4DED3"/>
-              <w:left w:val="single" w:sz="4" w:space="0" w:color="E4DED3"/>
-              <w:bottom w:val="single" w:sz="4" w:space="0" w:color="E4DED3"/>
-              <w:right w:val="single" w:sz="4" w:space="0" w:color="E4DED3"/>
-            </w:tcBorders>
-          </w:tcPr>
-          <w:p>
-            <w:r>
-              <w:rPr>
-                <w:i/>
-                <w:color w:val="6B6660"/>
-                <w:sz w:val="19"/>
-              </w:rPr>
-              <w:t>[ ref ]</w:t>
-            </w:r>
-          </w:p>
-        </w:tc>
-      </w:tr>
-      <w:tr>
-        <w:tc>
-          <w:tcPr>
-            <w:tcW w:type="dxa" w:w="3685"/>
-            <w:tcBorders>
-              <w:top w:val="single" w:sz="4" w:space="0" w:color="E4DED3"/>
-              <w:left w:val="single" w:sz="4" w:space="0" w:color="E4DED3"/>
-              <w:bottom w:val="single" w:sz="4" w:space="0" w:color="E4DED3"/>
-              <w:right w:val="single" w:sz="4" w:space="0" w:color="E4DED3"/>
-            </w:tcBorders>
-          </w:tcPr>
-          <w:p>
-            <w:r>
-              <w:rPr>
-                <w:sz w:val="19"/>
-              </w:rPr>
               <w:t>Test evidence (Appendix C)</w:t>
             </w:r>
           </w:p>
@@ -2550,353 +2702,6 @@
                 <w:sz w:val="19"/>
               </w:rPr>
               <w:t>[ ref ]</w:t>
-            </w:r>
-          </w:p>
-        </w:tc>
-      </w:tr>
-    </w:tbl>
-    <w:p/>
-    <w:p>
-      <w:pPr>
-        <w:pStyle w:val="Heading3"/>
-      </w:pPr>
-      <w:r>
-        <w:t>7.5 Sign-off</w:t>
-      </w:r>
-    </w:p>
-    <w:tbl>
-      <w:tblPr>
-        <w:tblW w:type="auto" w:w="0"/>
-        <w:jc w:val="center"/>
-        <w:tblLayout w:type="autofit"/>
-        <w:tblLook w:firstColumn="1" w:firstRow="1" w:lastColumn="0" w:lastRow="0" w:noHBand="0" w:noVBand="1" w:val="04A0"/>
-      </w:tblPr>
-      <w:tblGrid>
-        <w:gridCol w:w="2353"/>
-        <w:gridCol w:w="2353"/>
-        <w:gridCol w:w="2353"/>
-        <w:gridCol w:w="2353"/>
-      </w:tblGrid>
-      <w:tr>
-        <w:tc>
-          <w:tcPr>
-            <w:tcW w:type="dxa" w:w="3118"/>
-            <w:shd w:val="clear" w:color="auto" w:fill="1F5A5C"/>
-            <w:tcBorders>
-              <w:top w:val="single" w:sz="4" w:space="0" w:color="E4DED3"/>
-              <w:left w:val="single" w:sz="4" w:space="0" w:color="E4DED3"/>
-              <w:bottom w:val="single" w:sz="4" w:space="0" w:color="E4DED3"/>
-              <w:right w:val="single" w:sz="4" w:space="0" w:color="E4DED3"/>
-            </w:tcBorders>
-          </w:tcPr>
-          <w:p>
-            <w:r>
-              <w:rPr>
-                <w:b/>
-                <w:color w:val="FFFFFF"/>
-                <w:sz w:val="19"/>
-              </w:rPr>
-              <w:t>Role</w:t>
-            </w:r>
-          </w:p>
-        </w:tc>
-        <w:tc>
-          <w:tcPr>
-            <w:tcW w:type="dxa" w:w="2551"/>
-            <w:shd w:val="clear" w:color="auto" w:fill="1F5A5C"/>
-            <w:tcBorders>
-              <w:top w:val="single" w:sz="4" w:space="0" w:color="E4DED3"/>
-              <w:left w:val="single" w:sz="4" w:space="0" w:color="E4DED3"/>
-              <w:bottom w:val="single" w:sz="4" w:space="0" w:color="E4DED3"/>
-              <w:right w:val="single" w:sz="4" w:space="0" w:color="E4DED3"/>
-            </w:tcBorders>
-          </w:tcPr>
-          <w:p>
-            <w:r>
-              <w:rPr>
-                <w:b/>
-                <w:color w:val="FFFFFF"/>
-                <w:sz w:val="19"/>
-              </w:rPr>
-              <w:t>Name</w:t>
-            </w:r>
-          </w:p>
-        </w:tc>
-        <w:tc>
-          <w:tcPr>
-            <w:tcW w:type="dxa" w:w="1417"/>
-            <w:shd w:val="clear" w:color="auto" w:fill="1F5A5C"/>
-            <w:tcBorders>
-              <w:top w:val="single" w:sz="4" w:space="0" w:color="E4DED3"/>
-              <w:left w:val="single" w:sz="4" w:space="0" w:color="E4DED3"/>
-              <w:bottom w:val="single" w:sz="4" w:space="0" w:color="E4DED3"/>
-              <w:right w:val="single" w:sz="4" w:space="0" w:color="E4DED3"/>
-            </w:tcBorders>
-          </w:tcPr>
-          <w:p>
-            <w:r>
-              <w:rPr>
-                <w:b/>
-                <w:color w:val="FFFFFF"/>
-                <w:sz w:val="19"/>
-              </w:rPr>
-              <w:t>Date</w:t>
-            </w:r>
-          </w:p>
-        </w:tc>
-        <w:tc>
-          <w:tcPr>
-            <w:tcW w:type="dxa" w:w="1701"/>
-            <w:shd w:val="clear" w:color="auto" w:fill="1F5A5C"/>
-            <w:tcBorders>
-              <w:top w:val="single" w:sz="4" w:space="0" w:color="E4DED3"/>
-              <w:left w:val="single" w:sz="4" w:space="0" w:color="E4DED3"/>
-              <w:bottom w:val="single" w:sz="4" w:space="0" w:color="E4DED3"/>
-              <w:right w:val="single" w:sz="4" w:space="0" w:color="E4DED3"/>
-            </w:tcBorders>
-          </w:tcPr>
-          <w:p>
-            <w:r>
-              <w:rPr>
-                <w:b/>
-                <w:color w:val="FFFFFF"/>
-                <w:sz w:val="19"/>
-              </w:rPr>
-              <w:t>Signature</w:t>
-            </w:r>
-          </w:p>
-        </w:tc>
-      </w:tr>
-      <w:tr>
-        <w:tc>
-          <w:tcPr>
-            <w:tcW w:type="dxa" w:w="3118"/>
-            <w:tcBorders>
-              <w:top w:val="single" w:sz="4" w:space="0" w:color="E4DED3"/>
-              <w:left w:val="single" w:sz="4" w:space="0" w:color="E4DED3"/>
-              <w:bottom w:val="single" w:sz="4" w:space="0" w:color="E4DED3"/>
-              <w:right w:val="single" w:sz="4" w:space="0" w:color="E4DED3"/>
-            </w:tcBorders>
-          </w:tcPr>
-          <w:p>
-            <w:r>
-              <w:rPr>
-                <w:sz w:val="19"/>
-              </w:rPr>
-              <w:t>Prepared by</w:t>
-            </w:r>
-          </w:p>
-        </w:tc>
-        <w:tc>
-          <w:tcPr>
-            <w:tcW w:type="dxa" w:w="2551"/>
-            <w:tcBorders>
-              <w:top w:val="single" w:sz="4" w:space="0" w:color="E4DED3"/>
-              <w:left w:val="single" w:sz="4" w:space="0" w:color="E4DED3"/>
-              <w:bottom w:val="single" w:sz="4" w:space="0" w:color="E4DED3"/>
-              <w:right w:val="single" w:sz="4" w:space="0" w:color="E4DED3"/>
-            </w:tcBorders>
-          </w:tcPr>
-          <w:p>
-            <w:r>
-              <w:rPr>
-                <w:i/>
-                <w:color w:val="6B6660"/>
-                <w:sz w:val="19"/>
-              </w:rPr>
-              <w:t>[ … ]</w:t>
-            </w:r>
-          </w:p>
-        </w:tc>
-        <w:tc>
-          <w:tcPr>
-            <w:tcW w:type="dxa" w:w="1417"/>
-            <w:tcBorders>
-              <w:top w:val="single" w:sz="4" w:space="0" w:color="E4DED3"/>
-              <w:left w:val="single" w:sz="4" w:space="0" w:color="E4DED3"/>
-              <w:bottom w:val="single" w:sz="4" w:space="0" w:color="E4DED3"/>
-              <w:right w:val="single" w:sz="4" w:space="0" w:color="E4DED3"/>
-            </w:tcBorders>
-          </w:tcPr>
-          <w:p>
-            <w:r>
-              <w:rPr>
-                <w:sz w:val="19"/>
-              </w:rPr>
-            </w:r>
-          </w:p>
-        </w:tc>
-        <w:tc>
-          <w:tcPr>
-            <w:tcW w:type="dxa" w:w="1701"/>
-            <w:tcBorders>
-              <w:top w:val="single" w:sz="4" w:space="0" w:color="E4DED3"/>
-              <w:left w:val="single" w:sz="4" w:space="0" w:color="E4DED3"/>
-              <w:bottom w:val="single" w:sz="4" w:space="0" w:color="E4DED3"/>
-              <w:right w:val="single" w:sz="4" w:space="0" w:color="E4DED3"/>
-            </w:tcBorders>
-          </w:tcPr>
-          <w:p>
-            <w:r>
-              <w:rPr>
-                <w:sz w:val="19"/>
-              </w:rPr>
-            </w:r>
-          </w:p>
-        </w:tc>
-      </w:tr>
-      <w:tr>
-        <w:tc>
-          <w:tcPr>
-            <w:tcW w:type="dxa" w:w="3118"/>
-            <w:tcBorders>
-              <w:top w:val="single" w:sz="4" w:space="0" w:color="E4DED3"/>
-              <w:left w:val="single" w:sz="4" w:space="0" w:color="E4DED3"/>
-              <w:bottom w:val="single" w:sz="4" w:space="0" w:color="E4DED3"/>
-              <w:right w:val="single" w:sz="4" w:space="0" w:color="E4DED3"/>
-            </w:tcBorders>
-          </w:tcPr>
-          <w:p>
-            <w:r>
-              <w:rPr>
-                <w:sz w:val="19"/>
-              </w:rPr>
-              <w:t>Reviewed by</w:t>
-            </w:r>
-          </w:p>
-        </w:tc>
-        <w:tc>
-          <w:tcPr>
-            <w:tcW w:type="dxa" w:w="2551"/>
-            <w:tcBorders>
-              <w:top w:val="single" w:sz="4" w:space="0" w:color="E4DED3"/>
-              <w:left w:val="single" w:sz="4" w:space="0" w:color="E4DED3"/>
-              <w:bottom w:val="single" w:sz="4" w:space="0" w:color="E4DED3"/>
-              <w:right w:val="single" w:sz="4" w:space="0" w:color="E4DED3"/>
-            </w:tcBorders>
-          </w:tcPr>
-          <w:p>
-            <w:r>
-              <w:rPr>
-                <w:i/>
-                <w:color w:val="6B6660"/>
-                <w:sz w:val="19"/>
-              </w:rPr>
-              <w:t>[ … ]</w:t>
-            </w:r>
-          </w:p>
-        </w:tc>
-        <w:tc>
-          <w:tcPr>
-            <w:tcW w:type="dxa" w:w="1417"/>
-            <w:tcBorders>
-              <w:top w:val="single" w:sz="4" w:space="0" w:color="E4DED3"/>
-              <w:left w:val="single" w:sz="4" w:space="0" w:color="E4DED3"/>
-              <w:bottom w:val="single" w:sz="4" w:space="0" w:color="E4DED3"/>
-              <w:right w:val="single" w:sz="4" w:space="0" w:color="E4DED3"/>
-            </w:tcBorders>
-          </w:tcPr>
-          <w:p>
-            <w:r>
-              <w:rPr>
-                <w:sz w:val="19"/>
-              </w:rPr>
-            </w:r>
-          </w:p>
-        </w:tc>
-        <w:tc>
-          <w:tcPr>
-            <w:tcW w:type="dxa" w:w="1701"/>
-            <w:tcBorders>
-              <w:top w:val="single" w:sz="4" w:space="0" w:color="E4DED3"/>
-              <w:left w:val="single" w:sz="4" w:space="0" w:color="E4DED3"/>
-              <w:bottom w:val="single" w:sz="4" w:space="0" w:color="E4DED3"/>
-              <w:right w:val="single" w:sz="4" w:space="0" w:color="E4DED3"/>
-            </w:tcBorders>
-          </w:tcPr>
-          <w:p>
-            <w:r>
-              <w:rPr>
-                <w:sz w:val="19"/>
-              </w:rPr>
-            </w:r>
-          </w:p>
-        </w:tc>
-      </w:tr>
-      <w:tr>
-        <w:tc>
-          <w:tcPr>
-            <w:tcW w:type="dxa" w:w="3118"/>
-            <w:tcBorders>
-              <w:top w:val="single" w:sz="4" w:space="0" w:color="E4DED3"/>
-              <w:left w:val="single" w:sz="4" w:space="0" w:color="E4DED3"/>
-              <w:bottom w:val="single" w:sz="4" w:space="0" w:color="E4DED3"/>
-              <w:right w:val="single" w:sz="4" w:space="0" w:color="E4DED3"/>
-            </w:tcBorders>
-          </w:tcPr>
-          <w:p>
-            <w:r>
-              <w:rPr>
-                <w:sz w:val="19"/>
-              </w:rPr>
-              <w:t>Approved by (acceptance authority)</w:t>
-            </w:r>
-          </w:p>
-        </w:tc>
-        <w:tc>
-          <w:tcPr>
-            <w:tcW w:type="dxa" w:w="2551"/>
-            <w:tcBorders>
-              <w:top w:val="single" w:sz="4" w:space="0" w:color="E4DED3"/>
-              <w:left w:val="single" w:sz="4" w:space="0" w:color="E4DED3"/>
-              <w:bottom w:val="single" w:sz="4" w:space="0" w:color="E4DED3"/>
-              <w:right w:val="single" w:sz="4" w:space="0" w:color="E4DED3"/>
-            </w:tcBorders>
-          </w:tcPr>
-          <w:p>
-            <w:r>
-              <w:rPr>
-                <w:i/>
-                <w:color w:val="6B6660"/>
-                <w:sz w:val="19"/>
-              </w:rPr>
-              <w:t>[ … ]</w:t>
-            </w:r>
-          </w:p>
-        </w:tc>
-        <w:tc>
-          <w:tcPr>
-            <w:tcW w:type="dxa" w:w="1417"/>
-            <w:tcBorders>
-              <w:top w:val="single" w:sz="4" w:space="0" w:color="E4DED3"/>
-              <w:left w:val="single" w:sz="4" w:space="0" w:color="E4DED3"/>
-              <w:bottom w:val="single" w:sz="4" w:space="0" w:color="E4DED3"/>
-              <w:right w:val="single" w:sz="4" w:space="0" w:color="E4DED3"/>
-            </w:tcBorders>
-          </w:tcPr>
-          <w:p>
-            <w:r>
-              <w:rPr>
-                <w:sz w:val="19"/>
-              </w:rPr>
-            </w:r>
-          </w:p>
-        </w:tc>
-        <w:tc>
-          <w:tcPr>
-            <w:tcW w:type="dxa" w:w="1701"/>
-            <w:tcBorders>
-              <w:top w:val="single" w:sz="4" w:space="0" w:color="E4DED3"/>
-              <w:left w:val="single" w:sz="4" w:space="0" w:color="E4DED3"/>
-              <w:bottom w:val="single" w:sz="4" w:space="0" w:color="E4DED3"/>
-              <w:right w:val="single" w:sz="4" w:space="0" w:color="E4DED3"/>
-            </w:tcBorders>
-          </w:tcPr>
-          <w:p>
-            <w:r>
-              <w:rPr>
-                <w:sz w:val="19"/>
-              </w:rPr>
             </w:r>
           </w:p>
         </w:tc>
@@ -3592,36 +3397,6 @@
         <w:pStyle w:val="Heading1"/>
       </w:pPr>
       <w:r>
-        <w:t>Appendix B — Configuration exports</w:t>
-      </w:r>
-    </w:p>
-    <w:p>
-      <w:pPr>
-        <w:spacing w:after="120"/>
-      </w:pPr>
-      <w:r>
-        <w:rPr>
-          <w:i/>
-          <w:color w:val="6B6660"/>
-          <w:sz w:val="19"/>
-        </w:rPr>
-        <w:t>Export each configuration (AWS CLI or console) and attach as a code block or file. Examples: IAM policies; security-group rules; VPC/subnet/route tables; launch template + ASG; ALB + target groups; RDS instance; S3 bucket policy/encryption; CloudWatch alarms.</w:t>
-      </w:r>
-    </w:p>
-    <w:p>
-      <w:r>
-        <w:rPr>
-          <w:i/>
-          <w:color w:val="6B6660"/>
-        </w:rPr>
-        <w:t>[ Configuration exports ]</w:t>
-      </w:r>
-    </w:p>
-    <w:p>
-      <w:pPr>
-        <w:pStyle w:val="Heading1"/>
-      </w:pPr>
-      <w:r>
         <w:t>Appendix C — Test evidence</w:t>
       </w:r>
     </w:p>

</xml_diff>

<commit_message>
templates: rebuild the AT2 deployment report after the Pass B changes
Co-Authored-By: Claude Opus 5 (1M context) <noreply@anthropic.com>
</commit_message>
<xml_diff>
--- a/public/templates/AT2-Deployment-Report-Template.docx
+++ b/public/templates/AT2-Deployment-Report-Template.docx
@@ -1164,7 +1164,7 @@
           <w:color w:val="6B6660"/>
           <w:sz w:val="19"/>
         </w:rPr>
-        <w:t>The approved design leaves eight decisions to the implementer (design §14). For each, state your choice and justify it against the YAT LMS workload described in the LMS Application Specification.</w:t>
+        <w:t>The approved design leaves two sizing decisions to the implementer (design §4.16). For each, name at least two options you considered, state the one you chose, and say why it suits the YAT LMS workload described in the LMS Application Specification.</w:t>
       </w:r>
     </w:p>
     <w:tbl>
@@ -1175,15 +1175,16 @@
         <w:tblLook w:firstColumn="1" w:firstRow="1" w:lastColumn="0" w:lastRow="0" w:noHBand="0" w:noVBand="1" w:val="04A0"/>
       </w:tblPr>
       <w:tblGrid>
-        <w:gridCol w:w="2353"/>
-        <w:gridCol w:w="2353"/>
-        <w:gridCol w:w="2353"/>
-        <w:gridCol w:w="2353"/>
+        <w:gridCol w:w="1882"/>
+        <w:gridCol w:w="1882"/>
+        <w:gridCol w:w="1882"/>
+        <w:gridCol w:w="1882"/>
+        <w:gridCol w:w="1882"/>
       </w:tblGrid>
       <w:tr>
         <w:tc>
           <w:tcPr>
-            <w:tcW w:type="dxa" w:w="567"/>
+            <w:tcW w:type="dxa" w:w="510"/>
             <w:shd w:val="clear" w:color="auto" w:fill="1F5A5C"/>
             <w:tcBorders>
               <w:top w:val="single" w:sz="4" w:space="0" w:color="E4DED3"/>
@@ -1205,7 +1206,7 @@
         </w:tc>
         <w:tc>
           <w:tcPr>
-            <w:tcW w:type="dxa" w:w="3402"/>
+            <w:tcW w:type="dxa" w:w="2041"/>
             <w:shd w:val="clear" w:color="auto" w:fill="1F5A5C"/>
             <w:tcBorders>
               <w:top w:val="single" w:sz="4" w:space="0" w:color="E4DED3"/>
@@ -1227,7 +1228,7 @@
         </w:tc>
         <w:tc>
           <w:tcPr>
-            <w:tcW w:type="dxa" w:w="2268"/>
+            <w:tcW w:type="dxa" w:w="2041"/>
             <w:shd w:val="clear" w:color="auto" w:fill="1F5A5C"/>
             <w:tcBorders>
               <w:top w:val="single" w:sz="4" w:space="0" w:color="E4DED3"/>
@@ -1243,13 +1244,13 @@
                 <w:color w:val="FFFFFF"/>
                 <w:sz w:val="19"/>
               </w:rPr>
-              <w:t>Your decision</w:t>
+              <w:t>Options you considered</w:t>
             </w:r>
           </w:p>
         </w:tc>
         <w:tc>
           <w:tcPr>
-            <w:tcW w:type="dxa" w:w="2551"/>
+            <w:tcW w:type="dxa" w:w="1474"/>
             <w:shd w:val="clear" w:color="auto" w:fill="1F5A5C"/>
             <w:tcBorders>
               <w:top w:val="single" w:sz="4" w:space="0" w:color="E4DED3"/>
@@ -1265,7 +1266,29 @@
                 <w:color w:val="FFFFFF"/>
                 <w:sz w:val="19"/>
               </w:rPr>
-              <w:t>Rationale</w:t>
+              <w:t>Your choice</w:t>
+            </w:r>
+          </w:p>
+        </w:tc>
+        <w:tc>
+          <w:tcPr>
+            <w:tcW w:type="dxa" w:w="2721"/>
+            <w:shd w:val="clear" w:color="auto" w:fill="1F5A5C"/>
+            <w:tcBorders>
+              <w:top w:val="single" w:sz="4" w:space="0" w:color="E4DED3"/>
+              <w:left w:val="single" w:sz="4" w:space="0" w:color="E4DED3"/>
+              <w:bottom w:val="single" w:sz="4" w:space="0" w:color="E4DED3"/>
+              <w:right w:val="single" w:sz="4" w:space="0" w:color="E4DED3"/>
+            </w:tcBorders>
+          </w:tcPr>
+          <w:p>
+            <w:r>
+              <w:rPr>
+                <w:b/>
+                <w:color w:val="FFFFFF"/>
+                <w:sz w:val="19"/>
+              </w:rPr>
+              <w:t>Why this one</w:t>
             </w:r>
           </w:p>
         </w:tc>
@@ -1273,7 +1296,7 @@
       <w:tr>
         <w:tc>
           <w:tcPr>
-            <w:tcW w:type="dxa" w:w="567"/>
+            <w:tcW w:type="dxa" w:w="510"/>
             <w:tcBorders>
               <w:top w:val="single" w:sz="4" w:space="0" w:color="E4DED3"/>
               <w:left w:val="single" w:sz="4" w:space="0" w:color="E4DED3"/>
@@ -1292,7 +1315,7 @@
         </w:tc>
         <w:tc>
           <w:tcPr>
-            <w:tcW w:type="dxa" w:w="3402"/>
+            <w:tcW w:type="dxa" w:w="2041"/>
             <w:tcBorders>
               <w:top w:val="single" w:sz="4" w:space="0" w:color="E4DED3"/>
               <w:left w:val="single" w:sz="4" w:space="0" w:color="E4DED3"/>
@@ -1305,13 +1328,34 @@
               <w:rPr>
                 <w:sz w:val="19"/>
               </w:rPr>
-              <w:t>EC2 instance type</w:t>
+              <w:t>Application-tier instance type</w:t>
             </w:r>
           </w:p>
         </w:tc>
         <w:tc>
           <w:tcPr>
-            <w:tcW w:type="dxa" w:w="2268"/>
+            <w:tcW w:type="dxa" w:w="2041"/>
+            <w:tcBorders>
+              <w:top w:val="single" w:sz="4" w:space="0" w:color="E4DED3"/>
+              <w:left w:val="single" w:sz="4" w:space="0" w:color="E4DED3"/>
+              <w:bottom w:val="single" w:sz="4" w:space="0" w:color="E4DED3"/>
+              <w:right w:val="single" w:sz="4" w:space="0" w:color="E4DED3"/>
+            </w:tcBorders>
+          </w:tcPr>
+          <w:p>
+            <w:r>
+              <w:rPr>
+                <w:i/>
+                <w:color w:val="6B6660"/>
+                <w:sz w:val="19"/>
+              </w:rPr>
+              <w:t>[ two candidates ]</w:t>
+            </w:r>
+          </w:p>
+        </w:tc>
+        <w:tc>
+          <w:tcPr>
+            <w:tcW w:type="dxa" w:w="1474"/>
             <w:tcBorders>
               <w:top w:val="single" w:sz="4" w:space="0" w:color="E4DED3"/>
               <w:left w:val="single" w:sz="4" w:space="0" w:color="E4DED3"/>
@@ -1332,7 +1376,7 @@
         </w:tc>
         <w:tc>
           <w:tcPr>
-            <w:tcW w:type="dxa" w:w="2551"/>
+            <w:tcW w:type="dxa" w:w="2721"/>
             <w:tcBorders>
               <w:top w:val="single" w:sz="4" w:space="0" w:color="E4DED3"/>
               <w:left w:val="single" w:sz="4" w:space="0" w:color="E4DED3"/>
@@ -1347,7 +1391,7 @@
                 <w:color w:val="6B6660"/>
                 <w:sz w:val="19"/>
               </w:rPr>
-              <w:t>[ concurrent-user load + cost envelope ]</w:t>
+              <w:t>[ concurrent-user load from the application spec ]</w:t>
             </w:r>
           </w:p>
         </w:tc>
@@ -1355,7 +1399,7 @@
       <w:tr>
         <w:tc>
           <w:tcPr>
-            <w:tcW w:type="dxa" w:w="567"/>
+            <w:tcW w:type="dxa" w:w="510"/>
             <w:tcBorders>
               <w:top w:val="single" w:sz="4" w:space="0" w:color="E4DED3"/>
               <w:left w:val="single" w:sz="4" w:space="0" w:color="E4DED3"/>
@@ -1374,7 +1418,7 @@
         </w:tc>
         <w:tc>
           <w:tcPr>
-            <w:tcW w:type="dxa" w:w="3402"/>
+            <w:tcW w:type="dxa" w:w="2041"/>
             <w:tcBorders>
               <w:top w:val="single" w:sz="4" w:space="0" w:color="E4DED3"/>
               <w:left w:val="single" w:sz="4" w:space="0" w:color="E4DED3"/>
@@ -1387,13 +1431,34 @@
               <w:rPr>
                 <w:sz w:val="19"/>
               </w:rPr>
-              <w:t>RDS instance class</w:t>
+              <w:t>Database instance class and storage size</w:t>
             </w:r>
           </w:p>
         </w:tc>
         <w:tc>
           <w:tcPr>
-            <w:tcW w:type="dxa" w:w="2268"/>
+            <w:tcW w:type="dxa" w:w="2041"/>
+            <w:tcBorders>
+              <w:top w:val="single" w:sz="4" w:space="0" w:color="E4DED3"/>
+              <w:left w:val="single" w:sz="4" w:space="0" w:color="E4DED3"/>
+              <w:bottom w:val="single" w:sz="4" w:space="0" w:color="E4DED3"/>
+              <w:right w:val="single" w:sz="4" w:space="0" w:color="E4DED3"/>
+            </w:tcBorders>
+          </w:tcPr>
+          <w:p>
+            <w:r>
+              <w:rPr>
+                <w:i/>
+                <w:color w:val="6B6660"/>
+                <w:sz w:val="19"/>
+              </w:rPr>
+              <w:t>[ two candidates ]</w:t>
+            </w:r>
+          </w:p>
+        </w:tc>
+        <w:tc>
+          <w:tcPr>
+            <w:tcW w:type="dxa" w:w="1474"/>
             <w:tcBorders>
               <w:top w:val="single" w:sz="4" w:space="0" w:color="E4DED3"/>
               <w:left w:val="single" w:sz="4" w:space="0" w:color="E4DED3"/>
@@ -1414,7 +1479,7 @@
         </w:tc>
         <w:tc>
           <w:tcPr>
-            <w:tcW w:type="dxa" w:w="2551"/>
+            <w:tcW w:type="dxa" w:w="2721"/>
             <w:tcBorders>
               <w:top w:val="single" w:sz="4" w:space="0" w:color="E4DED3"/>
               <w:left w:val="single" w:sz="4" w:space="0" w:color="E4DED3"/>
@@ -1429,499 +1494,7 @@
                 <w:color w:val="6B6660"/>
                 <w:sz w:val="19"/>
               </w:rPr>
-              <w:t>[ database workload characteristics ]</w:t>
-            </w:r>
-          </w:p>
-        </w:tc>
-      </w:tr>
-      <w:tr>
-        <w:tc>
-          <w:tcPr>
-            <w:tcW w:type="dxa" w:w="567"/>
-            <w:tcBorders>
-              <w:top w:val="single" w:sz="4" w:space="0" w:color="E4DED3"/>
-              <w:left w:val="single" w:sz="4" w:space="0" w:color="E4DED3"/>
-              <w:bottom w:val="single" w:sz="4" w:space="0" w:color="E4DED3"/>
-              <w:right w:val="single" w:sz="4" w:space="0" w:color="E4DED3"/>
-            </w:tcBorders>
-          </w:tcPr>
-          <w:p>
-            <w:r>
-              <w:rPr>
-                <w:sz w:val="19"/>
-              </w:rPr>
-              <w:t>C3</w:t>
-            </w:r>
-          </w:p>
-        </w:tc>
-        <w:tc>
-          <w:tcPr>
-            <w:tcW w:type="dxa" w:w="3402"/>
-            <w:tcBorders>
-              <w:top w:val="single" w:sz="4" w:space="0" w:color="E4DED3"/>
-              <w:left w:val="single" w:sz="4" w:space="0" w:color="E4DED3"/>
-              <w:bottom w:val="single" w:sz="4" w:space="0" w:color="E4DED3"/>
-              <w:right w:val="single" w:sz="4" w:space="0" w:color="E4DED3"/>
-            </w:tcBorders>
-          </w:tcPr>
-          <w:p>
-            <w:r>
-              <w:rPr>
-                <w:sz w:val="19"/>
-              </w:rPr>
-              <w:t>EBS data volume + RDS storage sizing</w:t>
-            </w:r>
-          </w:p>
-        </w:tc>
-        <w:tc>
-          <w:tcPr>
-            <w:tcW w:type="dxa" w:w="2268"/>
-            <w:tcBorders>
-              <w:top w:val="single" w:sz="4" w:space="0" w:color="E4DED3"/>
-              <w:left w:val="single" w:sz="4" w:space="0" w:color="E4DED3"/>
-              <w:bottom w:val="single" w:sz="4" w:space="0" w:color="E4DED3"/>
-              <w:right w:val="single" w:sz="4" w:space="0" w:color="E4DED3"/>
-            </w:tcBorders>
-          </w:tcPr>
-          <w:p>
-            <w:r>
-              <w:rPr>
-                <w:i/>
-                <w:color w:val="6B6660"/>
-                <w:sz w:val="19"/>
-              </w:rPr>
-              <w:t>[ show the calc ]</w:t>
-            </w:r>
-          </w:p>
-        </w:tc>
-        <w:tc>
-          <w:tcPr>
-            <w:tcW w:type="dxa" w:w="2551"/>
-            <w:tcBorders>
-              <w:top w:val="single" w:sz="4" w:space="0" w:color="E4DED3"/>
-              <w:left w:val="single" w:sz="4" w:space="0" w:color="E4DED3"/>
-              <w:bottom w:val="single" w:sz="4" w:space="0" w:color="E4DED3"/>
-              <w:right w:val="single" w:sz="4" w:space="0" w:color="E4DED3"/>
-            </w:tcBorders>
-          </w:tcPr>
-          <w:p>
-            <w:r>
-              <w:rPr>
-                <w:i/>
-                <w:color w:val="6B6660"/>
-                <w:sz w:val="19"/>
-              </w:rPr>
-              <w:t>[ current footprint + growth ]</w:t>
-            </w:r>
-          </w:p>
-        </w:tc>
-      </w:tr>
-      <w:tr>
-        <w:tc>
-          <w:tcPr>
-            <w:tcW w:type="dxa" w:w="567"/>
-            <w:tcBorders>
-              <w:top w:val="single" w:sz="4" w:space="0" w:color="E4DED3"/>
-              <w:left w:val="single" w:sz="4" w:space="0" w:color="E4DED3"/>
-              <w:bottom w:val="single" w:sz="4" w:space="0" w:color="E4DED3"/>
-              <w:right w:val="single" w:sz="4" w:space="0" w:color="E4DED3"/>
-            </w:tcBorders>
-          </w:tcPr>
-          <w:p>
-            <w:r>
-              <w:rPr>
-                <w:sz w:val="19"/>
-              </w:rPr>
-              <w:t>C4</w:t>
-            </w:r>
-          </w:p>
-        </w:tc>
-        <w:tc>
-          <w:tcPr>
-            <w:tcW w:type="dxa" w:w="3402"/>
-            <w:tcBorders>
-              <w:top w:val="single" w:sz="4" w:space="0" w:color="E4DED3"/>
-              <w:left w:val="single" w:sz="4" w:space="0" w:color="E4DED3"/>
-              <w:bottom w:val="single" w:sz="4" w:space="0" w:color="E4DED3"/>
-              <w:right w:val="single" w:sz="4" w:space="0" w:color="E4DED3"/>
-            </w:tcBorders>
-          </w:tcPr>
-          <w:p>
-            <w:r>
-              <w:rPr>
-                <w:sz w:val="19"/>
-              </w:rPr>
-              <w:t>ASG scaling threshold</w:t>
-            </w:r>
-          </w:p>
-        </w:tc>
-        <w:tc>
-          <w:tcPr>
-            <w:tcW w:type="dxa" w:w="2268"/>
-            <w:tcBorders>
-              <w:top w:val="single" w:sz="4" w:space="0" w:color="E4DED3"/>
-              <w:left w:val="single" w:sz="4" w:space="0" w:color="E4DED3"/>
-              <w:bottom w:val="single" w:sz="4" w:space="0" w:color="E4DED3"/>
-              <w:right w:val="single" w:sz="4" w:space="0" w:color="E4DED3"/>
-            </w:tcBorders>
-          </w:tcPr>
-          <w:p>
-            <w:r>
-              <w:rPr>
-                <w:i/>
-                <w:color w:val="6B6660"/>
-                <w:sz w:val="19"/>
-              </w:rPr>
-              <w:t>[ … ]</w:t>
-            </w:r>
-          </w:p>
-        </w:tc>
-        <w:tc>
-          <w:tcPr>
-            <w:tcW w:type="dxa" w:w="2551"/>
-            <w:tcBorders>
-              <w:top w:val="single" w:sz="4" w:space="0" w:color="E4DED3"/>
-              <w:left w:val="single" w:sz="4" w:space="0" w:color="E4DED3"/>
-              <w:bottom w:val="single" w:sz="4" w:space="0" w:color="E4DED3"/>
-              <w:right w:val="single" w:sz="4" w:space="0" w:color="E4DED3"/>
-            </w:tcBorders>
-          </w:tcPr>
-          <w:p>
-            <w:r>
-              <w:rPr>
-                <w:i/>
-                <w:color w:val="6B6660"/>
-                <w:sz w:val="19"/>
-              </w:rPr>
-              <w:t>[ expected CPU profile at peak ]</w:t>
-            </w:r>
-          </w:p>
-        </w:tc>
-      </w:tr>
-      <w:tr>
-        <w:tc>
-          <w:tcPr>
-            <w:tcW w:type="dxa" w:w="567"/>
-            <w:tcBorders>
-              <w:top w:val="single" w:sz="4" w:space="0" w:color="E4DED3"/>
-              <w:left w:val="single" w:sz="4" w:space="0" w:color="E4DED3"/>
-              <w:bottom w:val="single" w:sz="4" w:space="0" w:color="E4DED3"/>
-              <w:right w:val="single" w:sz="4" w:space="0" w:color="E4DED3"/>
-            </w:tcBorders>
-          </w:tcPr>
-          <w:p>
-            <w:r>
-              <w:rPr>
-                <w:sz w:val="19"/>
-              </w:rPr>
-              <w:t>C5</w:t>
-            </w:r>
-          </w:p>
-        </w:tc>
-        <w:tc>
-          <w:tcPr>
-            <w:tcW w:type="dxa" w:w="3402"/>
-            <w:tcBorders>
-              <w:top w:val="single" w:sz="4" w:space="0" w:color="E4DED3"/>
-              <w:left w:val="single" w:sz="4" w:space="0" w:color="E4DED3"/>
-              <w:bottom w:val="single" w:sz="4" w:space="0" w:color="E4DED3"/>
-              <w:right w:val="single" w:sz="4" w:space="0" w:color="E4DED3"/>
-            </w:tcBorders>
-          </w:tcPr>
-          <w:p>
-            <w:r>
-              <w:rPr>
-                <w:sz w:val="19"/>
-              </w:rPr>
-              <w:t>Permission boundary for MTS-Consultants</w:t>
-            </w:r>
-          </w:p>
-        </w:tc>
-        <w:tc>
-          <w:tcPr>
-            <w:tcW w:type="dxa" w:w="2268"/>
-            <w:tcBorders>
-              <w:top w:val="single" w:sz="4" w:space="0" w:color="E4DED3"/>
-              <w:left w:val="single" w:sz="4" w:space="0" w:color="E4DED3"/>
-              <w:bottom w:val="single" w:sz="4" w:space="0" w:color="E4DED3"/>
-              <w:right w:val="single" w:sz="4" w:space="0" w:color="E4DED3"/>
-            </w:tcBorders>
-          </w:tcPr>
-          <w:p>
-            <w:r>
-              <w:rPr>
-                <w:i/>
-                <w:color w:val="6B6660"/>
-                <w:sz w:val="19"/>
-              </w:rPr>
-              <w:t>[ … ]</w:t>
-            </w:r>
-          </w:p>
-        </w:tc>
-        <w:tc>
-          <w:tcPr>
-            <w:tcW w:type="dxa" w:w="2551"/>
-            <w:tcBorders>
-              <w:top w:val="single" w:sz="4" w:space="0" w:color="E4DED3"/>
-              <w:left w:val="single" w:sz="4" w:space="0" w:color="E4DED3"/>
-              <w:bottom w:val="single" w:sz="4" w:space="0" w:color="E4DED3"/>
-              <w:right w:val="single" w:sz="4" w:space="0" w:color="E4DED3"/>
-            </w:tcBorders>
-          </w:tcPr>
-          <w:p>
-            <w:r>
-              <w:rPr>
-                <w:i/>
-                <w:color w:val="6B6660"/>
-                <w:sz w:val="19"/>
-              </w:rPr>
-              <w:t>[ … ]</w:t>
-            </w:r>
-          </w:p>
-        </w:tc>
-      </w:tr>
-      <w:tr>
-        <w:tc>
-          <w:tcPr>
-            <w:tcW w:type="dxa" w:w="567"/>
-            <w:tcBorders>
-              <w:top w:val="single" w:sz="4" w:space="0" w:color="E4DED3"/>
-              <w:left w:val="single" w:sz="4" w:space="0" w:color="E4DED3"/>
-              <w:bottom w:val="single" w:sz="4" w:space="0" w:color="E4DED3"/>
-              <w:right w:val="single" w:sz="4" w:space="0" w:color="E4DED3"/>
-            </w:tcBorders>
-          </w:tcPr>
-          <w:p>
-            <w:r>
-              <w:rPr>
-                <w:sz w:val="19"/>
-              </w:rPr>
-              <w:t>C6</w:t>
-            </w:r>
-          </w:p>
-        </w:tc>
-        <w:tc>
-          <w:tcPr>
-            <w:tcW w:type="dxa" w:w="3402"/>
-            <w:tcBorders>
-              <w:top w:val="single" w:sz="4" w:space="0" w:color="E4DED3"/>
-              <w:left w:val="single" w:sz="4" w:space="0" w:color="E4DED3"/>
-              <w:bottom w:val="single" w:sz="4" w:space="0" w:color="E4DED3"/>
-              <w:right w:val="single" w:sz="4" w:space="0" w:color="E4DED3"/>
-            </w:tcBorders>
-          </w:tcPr>
-          <w:p>
-            <w:r>
-              <w:rPr>
-                <w:sz w:val="19"/>
-              </w:rPr>
-              <w:t>Bastion / RDP design</w:t>
-            </w:r>
-          </w:p>
-        </w:tc>
-        <w:tc>
-          <w:tcPr>
-            <w:tcW w:type="dxa" w:w="2268"/>
-            <w:tcBorders>
-              <w:top w:val="single" w:sz="4" w:space="0" w:color="E4DED3"/>
-              <w:left w:val="single" w:sz="4" w:space="0" w:color="E4DED3"/>
-              <w:bottom w:val="single" w:sz="4" w:space="0" w:color="E4DED3"/>
-              <w:right w:val="single" w:sz="4" w:space="0" w:color="E4DED3"/>
-            </w:tcBorders>
-          </w:tcPr>
-          <w:p>
-            <w:r>
-              <w:rPr>
-                <w:i/>
-                <w:color w:val="6B6660"/>
-                <w:sz w:val="19"/>
-              </w:rPr>
-              <w:t>[ … ]</w:t>
-            </w:r>
-          </w:p>
-        </w:tc>
-        <w:tc>
-          <w:tcPr>
-            <w:tcW w:type="dxa" w:w="2551"/>
-            <w:tcBorders>
-              <w:top w:val="single" w:sz="4" w:space="0" w:color="E4DED3"/>
-              <w:left w:val="single" w:sz="4" w:space="0" w:color="E4DED3"/>
-              <w:bottom w:val="single" w:sz="4" w:space="0" w:color="E4DED3"/>
-              <w:right w:val="single" w:sz="4" w:space="0" w:color="E4DED3"/>
-            </w:tcBorders>
-          </w:tcPr>
-          <w:p>
-            <w:r>
-              <w:rPr>
-                <w:i/>
-                <w:color w:val="6B6660"/>
-                <w:sz w:val="19"/>
-              </w:rPr>
-              <w:t>[ security trade-off ]</w:t>
-            </w:r>
-          </w:p>
-        </w:tc>
-      </w:tr>
-      <w:tr>
-        <w:tc>
-          <w:tcPr>
-            <w:tcW w:type="dxa" w:w="567"/>
-            <w:tcBorders>
-              <w:top w:val="single" w:sz="4" w:space="0" w:color="E4DED3"/>
-              <w:left w:val="single" w:sz="4" w:space="0" w:color="E4DED3"/>
-              <w:bottom w:val="single" w:sz="4" w:space="0" w:color="E4DED3"/>
-              <w:right w:val="single" w:sz="4" w:space="0" w:color="E4DED3"/>
-            </w:tcBorders>
-          </w:tcPr>
-          <w:p>
-            <w:r>
-              <w:rPr>
-                <w:sz w:val="19"/>
-              </w:rPr>
-              <w:t>C7</w:t>
-            </w:r>
-          </w:p>
-        </w:tc>
-        <w:tc>
-          <w:tcPr>
-            <w:tcW w:type="dxa" w:w="3402"/>
-            <w:tcBorders>
-              <w:top w:val="single" w:sz="4" w:space="0" w:color="E4DED3"/>
-              <w:left w:val="single" w:sz="4" w:space="0" w:color="E4DED3"/>
-              <w:bottom w:val="single" w:sz="4" w:space="0" w:color="E4DED3"/>
-              <w:right w:val="single" w:sz="4" w:space="0" w:color="E4DED3"/>
-            </w:tcBorders>
-          </w:tcPr>
-          <w:p>
-            <w:r>
-              <w:rPr>
-                <w:sz w:val="19"/>
-              </w:rPr>
-              <w:t>MySQL engine version</w:t>
-            </w:r>
-          </w:p>
-        </w:tc>
-        <w:tc>
-          <w:tcPr>
-            <w:tcW w:type="dxa" w:w="2268"/>
-            <w:tcBorders>
-              <w:top w:val="single" w:sz="4" w:space="0" w:color="E4DED3"/>
-              <w:left w:val="single" w:sz="4" w:space="0" w:color="E4DED3"/>
-              <w:bottom w:val="single" w:sz="4" w:space="0" w:color="E4DED3"/>
-              <w:right w:val="single" w:sz="4" w:space="0" w:color="E4DED3"/>
-            </w:tcBorders>
-          </w:tcPr>
-          <w:p>
-            <w:r>
-              <w:rPr>
-                <w:i/>
-                <w:color w:val="6B6660"/>
-                <w:sz w:val="19"/>
-              </w:rPr>
-              <w:t>[ … ]</w:t>
-            </w:r>
-          </w:p>
-        </w:tc>
-        <w:tc>
-          <w:tcPr>
-            <w:tcW w:type="dxa" w:w="2551"/>
-            <w:tcBorders>
-              <w:top w:val="single" w:sz="4" w:space="0" w:color="E4DED3"/>
-              <w:left w:val="single" w:sz="4" w:space="0" w:color="E4DED3"/>
-              <w:bottom w:val="single" w:sz="4" w:space="0" w:color="E4DED3"/>
-              <w:right w:val="single" w:sz="4" w:space="0" w:color="E4DED3"/>
-            </w:tcBorders>
-          </w:tcPr>
-          <w:p>
-            <w:r>
-              <w:rPr>
-                <w:i/>
-                <w:color w:val="6B6660"/>
-                <w:sz w:val="19"/>
-              </w:rPr>
-              <w:t>[ application compatibility ]</w:t>
-            </w:r>
-          </w:p>
-        </w:tc>
-      </w:tr>
-      <w:tr>
-        <w:tc>
-          <w:tcPr>
-            <w:tcW w:type="dxa" w:w="567"/>
-            <w:tcBorders>
-              <w:top w:val="single" w:sz="4" w:space="0" w:color="E4DED3"/>
-              <w:left w:val="single" w:sz="4" w:space="0" w:color="E4DED3"/>
-              <w:bottom w:val="single" w:sz="4" w:space="0" w:color="E4DED3"/>
-              <w:right w:val="single" w:sz="4" w:space="0" w:color="E4DED3"/>
-            </w:tcBorders>
-          </w:tcPr>
-          <w:p>
-            <w:r>
-              <w:rPr>
-                <w:sz w:val="19"/>
-              </w:rPr>
-              <w:t>C8</w:t>
-            </w:r>
-          </w:p>
-        </w:tc>
-        <w:tc>
-          <w:tcPr>
-            <w:tcW w:type="dxa" w:w="3402"/>
-            <w:tcBorders>
-              <w:top w:val="single" w:sz="4" w:space="0" w:color="E4DED3"/>
-              <w:left w:val="single" w:sz="4" w:space="0" w:color="E4DED3"/>
-              <w:bottom w:val="single" w:sz="4" w:space="0" w:color="E4DED3"/>
-              <w:right w:val="single" w:sz="4" w:space="0" w:color="E4DED3"/>
-            </w:tcBorders>
-          </w:tcPr>
-          <w:p>
-            <w:r>
-              <w:rPr>
-                <w:sz w:val="19"/>
-              </w:rPr>
-              <w:t>DNS strategy + ACM certificate</w:t>
-            </w:r>
-          </w:p>
-        </w:tc>
-        <w:tc>
-          <w:tcPr>
-            <w:tcW w:type="dxa" w:w="2268"/>
-            <w:tcBorders>
-              <w:top w:val="single" w:sz="4" w:space="0" w:color="E4DED3"/>
-              <w:left w:val="single" w:sz="4" w:space="0" w:color="E4DED3"/>
-              <w:bottom w:val="single" w:sz="4" w:space="0" w:color="E4DED3"/>
-              <w:right w:val="single" w:sz="4" w:space="0" w:color="E4DED3"/>
-            </w:tcBorders>
-          </w:tcPr>
-          <w:p>
-            <w:r>
-              <w:rPr>
-                <w:i/>
-                <w:color w:val="6B6660"/>
-                <w:sz w:val="19"/>
-              </w:rPr>
-              <w:t>[ … ]</w:t>
-            </w:r>
-          </w:p>
-        </w:tc>
-        <w:tc>
-          <w:tcPr>
-            <w:tcW w:type="dxa" w:w="2551"/>
-            <w:tcBorders>
-              <w:top w:val="single" w:sz="4" w:space="0" w:color="E4DED3"/>
-              <w:left w:val="single" w:sz="4" w:space="0" w:color="E4DED3"/>
-              <w:bottom w:val="single" w:sz="4" w:space="0" w:color="E4DED3"/>
-              <w:right w:val="single" w:sz="4" w:space="0" w:color="E4DED3"/>
-            </w:tcBorders>
-          </w:tcPr>
-          <w:p>
-            <w:r>
-              <w:rPr>
-                <w:i/>
-                <w:color w:val="6B6660"/>
-                <w:sz w:val="19"/>
-              </w:rPr>
-              <w:t>[ … ]</w:t>
+              <w:t>[ database workload; current data footprint and its growth ]</w:t>
             </w:r>
           </w:p>
         </w:tc>
@@ -1946,7 +1519,7 @@
           <w:color w:val="6B6660"/>
           <w:sz w:val="19"/>
         </w:rPr>
-        <w:t>Document the tests run to verify the deployment. For each test, state the test, the result, and reference the supporting evidence in Appendix C.</w:t>
+        <w:t>Five tests confirm the deployment works. Each one below tells you what it demonstrates and the exact steps to run it. Follow the steps, then paste the screenshot into the box provided. If a test does not pass, fix the problem, re-run it, and note what you changed.</w:t>
       </w:r>
     </w:p>
     <w:p>
@@ -1954,349 +1527,7 @@
         <w:pStyle w:val="Heading3"/>
       </w:pPr>
       <w:r>
-        <w:t>6.1 Connectivity tests</w:t>
-      </w:r>
-    </w:p>
-    <w:tbl>
-      <w:tblPr>
-        <w:tblW w:type="auto" w:w="0"/>
-        <w:jc w:val="center"/>
-        <w:tblLayout w:type="autofit"/>
-        <w:tblLook w:firstColumn="1" w:firstRow="1" w:lastColumn="0" w:lastRow="0" w:noHBand="0" w:noVBand="1" w:val="04A0"/>
-      </w:tblPr>
-      <w:tblGrid>
-        <w:gridCol w:w="3137"/>
-        <w:gridCol w:w="3137"/>
-        <w:gridCol w:w="3137"/>
-      </w:tblGrid>
-      <w:tr>
-        <w:tc>
-          <w:tcPr>
-            <w:tcW w:type="dxa" w:w="3969"/>
-            <w:shd w:val="clear" w:color="auto" w:fill="1F5A5C"/>
-            <w:tcBorders>
-              <w:top w:val="single" w:sz="4" w:space="0" w:color="E4DED3"/>
-              <w:left w:val="single" w:sz="4" w:space="0" w:color="E4DED3"/>
-              <w:bottom w:val="single" w:sz="4" w:space="0" w:color="E4DED3"/>
-              <w:right w:val="single" w:sz="4" w:space="0" w:color="E4DED3"/>
-            </w:tcBorders>
-          </w:tcPr>
-          <w:p>
-            <w:r>
-              <w:rPr>
-                <w:b/>
-                <w:color w:val="FFFFFF"/>
-                <w:sz w:val="19"/>
-              </w:rPr>
-              <w:t>Test</w:t>
-            </w:r>
-          </w:p>
-        </w:tc>
-        <w:tc>
-          <w:tcPr>
-            <w:tcW w:type="dxa" w:w="2268"/>
-            <w:shd w:val="clear" w:color="auto" w:fill="1F5A5C"/>
-            <w:tcBorders>
-              <w:top w:val="single" w:sz="4" w:space="0" w:color="E4DED3"/>
-              <w:left w:val="single" w:sz="4" w:space="0" w:color="E4DED3"/>
-              <w:bottom w:val="single" w:sz="4" w:space="0" w:color="E4DED3"/>
-              <w:right w:val="single" w:sz="4" w:space="0" w:color="E4DED3"/>
-            </w:tcBorders>
-          </w:tcPr>
-          <w:p>
-            <w:r>
-              <w:rPr>
-                <w:b/>
-                <w:color w:val="FFFFFF"/>
-                <w:sz w:val="19"/>
-              </w:rPr>
-              <w:t>Outcome (Pass/Fail)</w:t>
-            </w:r>
-          </w:p>
-        </w:tc>
-        <w:tc>
-          <w:tcPr>
-            <w:tcW w:type="dxa" w:w="2551"/>
-            <w:shd w:val="clear" w:color="auto" w:fill="1F5A5C"/>
-            <w:tcBorders>
-              <w:top w:val="single" w:sz="4" w:space="0" w:color="E4DED3"/>
-              <w:left w:val="single" w:sz="4" w:space="0" w:color="E4DED3"/>
-              <w:bottom w:val="single" w:sz="4" w:space="0" w:color="E4DED3"/>
-              <w:right w:val="single" w:sz="4" w:space="0" w:color="E4DED3"/>
-            </w:tcBorders>
-          </w:tcPr>
-          <w:p>
-            <w:r>
-              <w:rPr>
-                <w:b/>
-                <w:color w:val="FFFFFF"/>
-                <w:sz w:val="19"/>
-              </w:rPr>
-              <w:t>Notes</w:t>
-            </w:r>
-          </w:p>
-        </w:tc>
-      </w:tr>
-      <w:tr>
-        <w:tc>
-          <w:tcPr>
-            <w:tcW w:type="dxa" w:w="3969"/>
-            <w:tcBorders>
-              <w:top w:val="single" w:sz="4" w:space="0" w:color="E4DED3"/>
-              <w:left w:val="single" w:sz="4" w:space="0" w:color="E4DED3"/>
-              <w:bottom w:val="single" w:sz="4" w:space="0" w:color="E4DED3"/>
-              <w:right w:val="single" w:sz="4" w:space="0" w:color="E4DED3"/>
-            </w:tcBorders>
-          </w:tcPr>
-          <w:p>
-            <w:r>
-              <w:rPr>
-                <w:sz w:val="19"/>
-              </w:rPr>
-              <w:t>ALB → EC2 health check</w:t>
-            </w:r>
-          </w:p>
-        </w:tc>
-        <w:tc>
-          <w:tcPr>
-            <w:tcW w:type="dxa" w:w="2268"/>
-            <w:tcBorders>
-              <w:top w:val="single" w:sz="4" w:space="0" w:color="E4DED3"/>
-              <w:left w:val="single" w:sz="4" w:space="0" w:color="E4DED3"/>
-              <w:bottom w:val="single" w:sz="4" w:space="0" w:color="E4DED3"/>
-              <w:right w:val="single" w:sz="4" w:space="0" w:color="E4DED3"/>
-            </w:tcBorders>
-          </w:tcPr>
-          <w:p>
-            <w:r>
-              <w:rPr>
-                <w:i/>
-                <w:color w:val="6B6660"/>
-                <w:sz w:val="19"/>
-              </w:rPr>
-              <w:t>[ ]</w:t>
-            </w:r>
-          </w:p>
-        </w:tc>
-        <w:tc>
-          <w:tcPr>
-            <w:tcW w:type="dxa" w:w="2551"/>
-            <w:tcBorders>
-              <w:top w:val="single" w:sz="4" w:space="0" w:color="E4DED3"/>
-              <w:left w:val="single" w:sz="4" w:space="0" w:color="E4DED3"/>
-              <w:bottom w:val="single" w:sz="4" w:space="0" w:color="E4DED3"/>
-              <w:right w:val="single" w:sz="4" w:space="0" w:color="E4DED3"/>
-            </w:tcBorders>
-          </w:tcPr>
-          <w:p>
-            <w:r>
-              <w:rPr>
-                <w:i/>
-                <w:color w:val="6B6660"/>
-                <w:sz w:val="19"/>
-              </w:rPr>
-              <w:t>[ ]</w:t>
-            </w:r>
-          </w:p>
-        </w:tc>
-      </w:tr>
-      <w:tr>
-        <w:tc>
-          <w:tcPr>
-            <w:tcW w:type="dxa" w:w="3969"/>
-            <w:tcBorders>
-              <w:top w:val="single" w:sz="4" w:space="0" w:color="E4DED3"/>
-              <w:left w:val="single" w:sz="4" w:space="0" w:color="E4DED3"/>
-              <w:bottom w:val="single" w:sz="4" w:space="0" w:color="E4DED3"/>
-              <w:right w:val="single" w:sz="4" w:space="0" w:color="E4DED3"/>
-            </w:tcBorders>
-          </w:tcPr>
-          <w:p>
-            <w:r>
-              <w:rPr>
-                <w:sz w:val="19"/>
-              </w:rPr>
-              <w:t>EC2 → RDS connection (private)</w:t>
-            </w:r>
-          </w:p>
-        </w:tc>
-        <w:tc>
-          <w:tcPr>
-            <w:tcW w:type="dxa" w:w="2268"/>
-            <w:tcBorders>
-              <w:top w:val="single" w:sz="4" w:space="0" w:color="E4DED3"/>
-              <w:left w:val="single" w:sz="4" w:space="0" w:color="E4DED3"/>
-              <w:bottom w:val="single" w:sz="4" w:space="0" w:color="E4DED3"/>
-              <w:right w:val="single" w:sz="4" w:space="0" w:color="E4DED3"/>
-            </w:tcBorders>
-          </w:tcPr>
-          <w:p>
-            <w:r>
-              <w:rPr>
-                <w:i/>
-                <w:color w:val="6B6660"/>
-                <w:sz w:val="19"/>
-              </w:rPr>
-              <w:t>[ ]</w:t>
-            </w:r>
-          </w:p>
-        </w:tc>
-        <w:tc>
-          <w:tcPr>
-            <w:tcW w:type="dxa" w:w="2551"/>
-            <w:tcBorders>
-              <w:top w:val="single" w:sz="4" w:space="0" w:color="E4DED3"/>
-              <w:left w:val="single" w:sz="4" w:space="0" w:color="E4DED3"/>
-              <w:bottom w:val="single" w:sz="4" w:space="0" w:color="E4DED3"/>
-              <w:right w:val="single" w:sz="4" w:space="0" w:color="E4DED3"/>
-            </w:tcBorders>
-          </w:tcPr>
-          <w:p>
-            <w:r>
-              <w:rPr>
-                <w:i/>
-                <w:color w:val="6B6660"/>
-                <w:sz w:val="19"/>
-              </w:rPr>
-              <w:t>[ ]</w:t>
-            </w:r>
-          </w:p>
-        </w:tc>
-      </w:tr>
-      <w:tr>
-        <w:tc>
-          <w:tcPr>
-            <w:tcW w:type="dxa" w:w="3969"/>
-            <w:tcBorders>
-              <w:top w:val="single" w:sz="4" w:space="0" w:color="E4DED3"/>
-              <w:left w:val="single" w:sz="4" w:space="0" w:color="E4DED3"/>
-              <w:bottom w:val="single" w:sz="4" w:space="0" w:color="E4DED3"/>
-              <w:right w:val="single" w:sz="4" w:space="0" w:color="E4DED3"/>
-            </w:tcBorders>
-          </w:tcPr>
-          <w:p>
-            <w:r>
-              <w:rPr>
-                <w:sz w:val="19"/>
-              </w:rPr>
-              <w:t>EC2 → internet via NAT</w:t>
-            </w:r>
-          </w:p>
-        </w:tc>
-        <w:tc>
-          <w:tcPr>
-            <w:tcW w:type="dxa" w:w="2268"/>
-            <w:tcBorders>
-              <w:top w:val="single" w:sz="4" w:space="0" w:color="E4DED3"/>
-              <w:left w:val="single" w:sz="4" w:space="0" w:color="E4DED3"/>
-              <w:bottom w:val="single" w:sz="4" w:space="0" w:color="E4DED3"/>
-              <w:right w:val="single" w:sz="4" w:space="0" w:color="E4DED3"/>
-            </w:tcBorders>
-          </w:tcPr>
-          <w:p>
-            <w:r>
-              <w:rPr>
-                <w:i/>
-                <w:color w:val="6B6660"/>
-                <w:sz w:val="19"/>
-              </w:rPr>
-              <w:t>[ ]</w:t>
-            </w:r>
-          </w:p>
-        </w:tc>
-        <w:tc>
-          <w:tcPr>
-            <w:tcW w:type="dxa" w:w="2551"/>
-            <w:tcBorders>
-              <w:top w:val="single" w:sz="4" w:space="0" w:color="E4DED3"/>
-              <w:left w:val="single" w:sz="4" w:space="0" w:color="E4DED3"/>
-              <w:bottom w:val="single" w:sz="4" w:space="0" w:color="E4DED3"/>
-              <w:right w:val="single" w:sz="4" w:space="0" w:color="E4DED3"/>
-            </w:tcBorders>
-          </w:tcPr>
-          <w:p>
-            <w:r>
-              <w:rPr>
-                <w:i/>
-                <w:color w:val="6B6660"/>
-                <w:sz w:val="19"/>
-              </w:rPr>
-              <w:t>[ ]</w:t>
-            </w:r>
-          </w:p>
-        </w:tc>
-      </w:tr>
-      <w:tr>
-        <w:tc>
-          <w:tcPr>
-            <w:tcW w:type="dxa" w:w="3969"/>
-            <w:tcBorders>
-              <w:top w:val="single" w:sz="4" w:space="0" w:color="E4DED3"/>
-              <w:left w:val="single" w:sz="4" w:space="0" w:color="E4DED3"/>
-              <w:bottom w:val="single" w:sz="4" w:space="0" w:color="E4DED3"/>
-              <w:right w:val="single" w:sz="4" w:space="0" w:color="E4DED3"/>
-            </w:tcBorders>
-          </w:tcPr>
-          <w:p>
-            <w:r>
-              <w:rPr>
-                <w:sz w:val="19"/>
-              </w:rPr>
-              <w:t>RDS not publicly reachable (negative test)</w:t>
-            </w:r>
-          </w:p>
-        </w:tc>
-        <w:tc>
-          <w:tcPr>
-            <w:tcW w:type="dxa" w:w="2268"/>
-            <w:tcBorders>
-              <w:top w:val="single" w:sz="4" w:space="0" w:color="E4DED3"/>
-              <w:left w:val="single" w:sz="4" w:space="0" w:color="E4DED3"/>
-              <w:bottom w:val="single" w:sz="4" w:space="0" w:color="E4DED3"/>
-              <w:right w:val="single" w:sz="4" w:space="0" w:color="E4DED3"/>
-            </w:tcBorders>
-          </w:tcPr>
-          <w:p>
-            <w:r>
-              <w:rPr>
-                <w:i/>
-                <w:color w:val="6B6660"/>
-                <w:sz w:val="19"/>
-              </w:rPr>
-              <w:t>[ ]</w:t>
-            </w:r>
-          </w:p>
-        </w:tc>
-        <w:tc>
-          <w:tcPr>
-            <w:tcW w:type="dxa" w:w="2551"/>
-            <w:tcBorders>
-              <w:top w:val="single" w:sz="4" w:space="0" w:color="E4DED3"/>
-              <w:left w:val="single" w:sz="4" w:space="0" w:color="E4DED3"/>
-              <w:bottom w:val="single" w:sz="4" w:space="0" w:color="E4DED3"/>
-              <w:right w:val="single" w:sz="4" w:space="0" w:color="E4DED3"/>
-            </w:tcBorders>
-          </w:tcPr>
-          <w:p>
-            <w:r>
-              <w:rPr>
-                <w:i/>
-                <w:color w:val="6B6660"/>
-                <w:sz w:val="19"/>
-              </w:rPr>
-              <w:t>[ ]</w:t>
-            </w:r>
-          </w:p>
-        </w:tc>
-      </w:tr>
-    </w:tbl>
-    <w:p/>
-    <w:p>
-      <w:pPr>
-        <w:pStyle w:val="Heading3"/>
-      </w:pPr>
-      <w:r>
-        <w:t>6.2 Autoscaling test</w:t>
+        <w:t>6.1 Connect to the application server</w:t>
       </w:r>
     </w:p>
     <w:p>
@@ -2309,24 +1540,141 @@
           <w:color w:val="6B6660"/>
           <w:sz w:val="19"/>
         </w:rPr>
-        <w:t>Trigger a scaling event (e.g. load against the ALB) and confirm the ASG scales out and back in. Cross-reference Appendix C.</w:t>
+        <w:t>What this test shows: you can reach the application server you built.</w:t>
       </w:r>
     </w:p>
     <w:p>
+      <w:pPr>
+        <w:spacing w:after="60"/>
+        <w:ind w:left="340"/>
+      </w:pPr>
       <w:r>
         <w:rPr>
-          <w:i/>
-          <w:color w:val="6B6660"/>
+          <w:b/>
+          <w:sz w:val="21"/>
         </w:rPr>
-        <w:t>[ Write your response here ]</w:t>
+        <w:t xml:space="preserve">1.  </w:t>
+      </w:r>
+      <w:r>
+        <w:rPr>
+          <w:sz w:val="21"/>
+        </w:rPr>
+        <w:t>In the AWS console, open EC2 and find your application instance in the instance list.</w:t>
       </w:r>
     </w:p>
+    <w:p>
+      <w:pPr>
+        <w:spacing w:after="60"/>
+        <w:ind w:left="340"/>
+      </w:pPr>
+      <w:r>
+        <w:rPr>
+          <w:b/>
+          <w:sz w:val="21"/>
+        </w:rPr>
+        <w:t xml:space="preserve">2.  </w:t>
+      </w:r>
+      <w:r>
+        <w:rPr>
+          <w:sz w:val="21"/>
+        </w:rPr>
+        <w:t>Copy its address from the details panel.</w:t>
+      </w:r>
+    </w:p>
+    <w:p>
+      <w:pPr>
+        <w:spacing w:after="60"/>
+        <w:ind w:left="340"/>
+      </w:pPr>
+      <w:r>
+        <w:rPr>
+          <w:b/>
+          <w:sz w:val="21"/>
+        </w:rPr>
+        <w:t xml:space="preserve">3.  </w:t>
+      </w:r>
+      <w:r>
+        <w:rPr>
+          <w:sz w:val="21"/>
+        </w:rPr>
+        <w:t>Open a terminal on your own computer and connect to the instance using the key pair and the connection command given in the engagement's build instructions.</w:t>
+      </w:r>
+    </w:p>
+    <w:p>
+      <w:pPr>
+        <w:spacing w:after="60"/>
+        <w:ind w:left="340"/>
+      </w:pPr>
+      <w:r>
+        <w:rPr>
+          <w:b/>
+          <w:sz w:val="21"/>
+        </w:rPr>
+        <w:t xml:space="preserve">4.  </w:t>
+      </w:r>
+      <w:r>
+        <w:rPr>
+          <w:sz w:val="21"/>
+        </w:rPr>
+        <w:t>When the prompt appears, run: hostname</w:t>
+      </w:r>
+    </w:p>
+    <w:p/>
+    <w:tbl>
+      <w:tblPr>
+        <w:tblW w:type="auto" w:w="0"/>
+        <w:tblLook w:firstColumn="1" w:firstRow="1" w:lastColumn="0" w:lastRow="0" w:noHBand="0" w:noVBand="1" w:val="04A0"/>
+      </w:tblPr>
+      <w:tblGrid>
+        <w:gridCol w:w="9412"/>
+      </w:tblGrid>
+      <w:tr>
+        <w:tc>
+          <w:tcPr>
+            <w:tcW w:type="dxa" w:w="9411"/>
+            <w:tcBorders>
+              <w:top w:val="single" w:sz="4" w:space="0" w:color="E4DED3"/>
+              <w:left w:val="single" w:sz="4" w:space="0" w:color="E4DED3"/>
+              <w:bottom w:val="single" w:sz="4" w:space="0" w:color="E4DED3"/>
+              <w:right w:val="single" w:sz="4" w:space="0" w:color="E4DED3"/>
+            </w:tcBorders>
+            <w:shd w:val="clear" w:color="auto" w:fill="F8F4ED"/>
+          </w:tcPr>
+          <w:p>
+            <w:pPr>
+              <w:jc w:val="center"/>
+            </w:pPr>
+            <w:r>
+              <w:rPr>
+                <w:b/>
+                <w:sz w:val="20"/>
+              </w:rPr>
+              <w:t>[ PASTE YOUR SCREENSHOT HERE ]</w:t>
+            </w:r>
+          </w:p>
+          <w:p>
+            <w:pPr>
+              <w:jc w:val="center"/>
+            </w:pPr>
+            <w:r>
+              <w:rPr>
+                <w:i/>
+                <w:color w:val="6B6660"/>
+                <w:sz w:val="18"/>
+              </w:rPr>
+              <w:t>your terminal, showing the connection succeeding and the hostname of the instance.</w:t>
+            </w:r>
+          </w:p>
+        </w:tc>
+      </w:tr>
+    </w:tbl>
+    <w:p/>
     <w:p>
       <w:pPr>
         <w:pStyle w:val="Heading3"/>
       </w:pPr>
       <w:r>
-        <w:t>6.3 Database connectivity and basic operations</w:t>
+        <w:t>6.2 Reach the internet from the application server</w:t>
       </w:r>
     </w:p>
     <w:p>
@@ -2339,24 +1687,103 @@
           <w:color w:val="6B6660"/>
           <w:sz w:val="19"/>
         </w:rPr>
-        <w:t>Confirm the database tier is reachable from the app tier over the private network, the engine version meets the application requirement, and encryption-in-transit is in place.</w:t>
+        <w:t>What this test shows: the application server can reach the internet through the NAT gateway, so it can be patched and can call external services.</w:t>
       </w:r>
     </w:p>
     <w:p>
+      <w:pPr>
+        <w:spacing w:after="60"/>
+        <w:ind w:left="340"/>
+      </w:pPr>
       <w:r>
         <w:rPr>
-          <w:i/>
-          <w:color w:val="6B6660"/>
+          <w:b/>
+          <w:sz w:val="21"/>
         </w:rPr>
-        <w:t>[ Write your response here ]</w:t>
+        <w:t xml:space="preserve">1.  </w:t>
+      </w:r>
+      <w:r>
+        <w:rPr>
+          <w:sz w:val="21"/>
+        </w:rPr>
+        <w:t>In the session you opened in 6.1, run: curl -I https://aws.amazon.com</w:t>
       </w:r>
     </w:p>
+    <w:p>
+      <w:pPr>
+        <w:spacing w:after="60"/>
+        <w:ind w:left="340"/>
+      </w:pPr>
+      <w:r>
+        <w:rPr>
+          <w:b/>
+          <w:sz w:val="21"/>
+        </w:rPr>
+        <w:t xml:space="preserve">2.  </w:t>
+      </w:r>
+      <w:r>
+        <w:rPr>
+          <w:sz w:val="21"/>
+        </w:rPr>
+        <w:t>Confirm the response begins with an HTTP status line.</w:t>
+      </w:r>
+    </w:p>
+    <w:p/>
+    <w:tbl>
+      <w:tblPr>
+        <w:tblW w:type="auto" w:w="0"/>
+        <w:tblLook w:firstColumn="1" w:firstRow="1" w:lastColumn="0" w:lastRow="0" w:noHBand="0" w:noVBand="1" w:val="04A0"/>
+      </w:tblPr>
+      <w:tblGrid>
+        <w:gridCol w:w="9412"/>
+      </w:tblGrid>
+      <w:tr>
+        <w:tc>
+          <w:tcPr>
+            <w:tcW w:type="dxa" w:w="9411"/>
+            <w:tcBorders>
+              <w:top w:val="single" w:sz="4" w:space="0" w:color="E4DED3"/>
+              <w:left w:val="single" w:sz="4" w:space="0" w:color="E4DED3"/>
+              <w:bottom w:val="single" w:sz="4" w:space="0" w:color="E4DED3"/>
+              <w:right w:val="single" w:sz="4" w:space="0" w:color="E4DED3"/>
+            </w:tcBorders>
+            <w:shd w:val="clear" w:color="auto" w:fill="F8F4ED"/>
+          </w:tcPr>
+          <w:p>
+            <w:pPr>
+              <w:jc w:val="center"/>
+            </w:pPr>
+            <w:r>
+              <w:rPr>
+                <w:b/>
+                <w:sz w:val="20"/>
+              </w:rPr>
+              <w:t>[ PASTE YOUR SCREENSHOT HERE ]</w:t>
+            </w:r>
+          </w:p>
+          <w:p>
+            <w:pPr>
+              <w:jc w:val="center"/>
+            </w:pPr>
+            <w:r>
+              <w:rPr>
+                <w:i/>
+                <w:color w:val="6B6660"/>
+                <w:sz w:val="18"/>
+              </w:rPr>
+              <w:t>the command and the HTTP response header it returned.</w:t>
+            </w:r>
+          </w:p>
+        </w:tc>
+      </w:tr>
+    </w:tbl>
+    <w:p/>
     <w:p>
       <w:pPr>
         <w:pStyle w:val="Heading3"/>
       </w:pPr>
       <w:r>
-        <w:t>6.4 Infrastructure end-to-end smoke test</w:t>
+        <w:t>6.3 Reach the database from the application server</w:t>
       </w:r>
     </w:p>
     <w:p>
@@ -2369,18 +1796,410 @@
           <w:color w:val="6B6660"/>
           <w:sz w:val="19"/>
         </w:rPr>
-        <w:t>Confirm the infrastructure is ready to serve traffic (e.g. a placeholder page via the ALB DNS returns HTTP 200/302 from a backend instance that can reach the database).</w:t>
+        <w:t>What this test shows: the application tier can reach the database tier privately, over port 3306.</w:t>
       </w:r>
     </w:p>
     <w:p>
+      <w:pPr>
+        <w:spacing w:after="60"/>
+        <w:ind w:left="340"/>
+      </w:pPr>
+      <w:r>
+        <w:rPr>
+          <w:b/>
+          <w:sz w:val="21"/>
+        </w:rPr>
+        <w:t xml:space="preserve">1.  </w:t>
+      </w:r>
+      <w:r>
+        <w:rPr>
+          <w:sz w:val="21"/>
+        </w:rPr>
+        <w:t>In the AWS console, open RDS and copy your database's endpoint address.</w:t>
+      </w:r>
+    </w:p>
+    <w:p>
+      <w:pPr>
+        <w:spacing w:after="60"/>
+        <w:ind w:left="340"/>
+      </w:pPr>
+      <w:r>
+        <w:rPr>
+          <w:b/>
+          <w:sz w:val="21"/>
+        </w:rPr>
+        <w:t xml:space="preserve">2.  </w:t>
+      </w:r>
+      <w:r>
+        <w:rPr>
+          <w:sz w:val="21"/>
+        </w:rPr>
+        <w:t>In the session from 6.1, run: nc -zv &lt;your-database-endpoint&gt; 3306</w:t>
+      </w:r>
+    </w:p>
+    <w:p>
+      <w:pPr>
+        <w:spacing w:after="60"/>
+        <w:ind w:left="340"/>
+      </w:pPr>
+      <w:r>
+        <w:rPr>
+          <w:b/>
+          <w:sz w:val="21"/>
+        </w:rPr>
+        <w:t xml:space="preserve">3.  </w:t>
+      </w:r>
+      <w:r>
+        <w:rPr>
+          <w:sz w:val="21"/>
+        </w:rPr>
+        <w:t>Confirm the result reports the connection succeeded.</w:t>
+      </w:r>
+    </w:p>
+    <w:p/>
+    <w:tbl>
+      <w:tblPr>
+        <w:tblW w:type="auto" w:w="0"/>
+        <w:tblLook w:firstColumn="1" w:firstRow="1" w:lastColumn="0" w:lastRow="0" w:noHBand="0" w:noVBand="1" w:val="04A0"/>
+      </w:tblPr>
+      <w:tblGrid>
+        <w:gridCol w:w="9412"/>
+      </w:tblGrid>
+      <w:tr>
+        <w:tc>
+          <w:tcPr>
+            <w:tcW w:type="dxa" w:w="9411"/>
+            <w:tcBorders>
+              <w:top w:val="single" w:sz="4" w:space="0" w:color="E4DED3"/>
+              <w:left w:val="single" w:sz="4" w:space="0" w:color="E4DED3"/>
+              <w:bottom w:val="single" w:sz="4" w:space="0" w:color="E4DED3"/>
+              <w:right w:val="single" w:sz="4" w:space="0" w:color="E4DED3"/>
+            </w:tcBorders>
+            <w:shd w:val="clear" w:color="auto" w:fill="F8F4ED"/>
+          </w:tcPr>
+          <w:p>
+            <w:pPr>
+              <w:jc w:val="center"/>
+            </w:pPr>
+            <w:r>
+              <w:rPr>
+                <w:b/>
+                <w:sz w:val="20"/>
+              </w:rPr>
+              <w:t>[ PASTE YOUR SCREENSHOT HERE ]</w:t>
+            </w:r>
+          </w:p>
+          <w:p>
+            <w:pPr>
+              <w:jc w:val="center"/>
+            </w:pPr>
+            <w:r>
+              <w:rPr>
+                <w:i/>
+                <w:color w:val="6B6660"/>
+                <w:sz w:val="18"/>
+              </w:rPr>
+              <w:t>the command and its output confirming the connection to port 3306 succeeded.</w:t>
+            </w:r>
+          </w:p>
+        </w:tc>
+      </w:tr>
+    </w:tbl>
+    <w:p/>
+    <w:p>
+      <w:pPr>
+        <w:pStyle w:val="Heading3"/>
+      </w:pPr>
+      <w:r>
+        <w:t>6.4 Reach the load balancer from the application server</w:t>
+      </w:r>
+    </w:p>
+    <w:p>
+      <w:pPr>
+        <w:spacing w:after="120"/>
+      </w:pPr>
       <w:r>
         <w:rPr>
           <w:i/>
           <w:color w:val="6B6660"/>
+          <w:sz w:val="19"/>
         </w:rPr>
-        <w:t>[ Write your response here ]</w:t>
+        <w:t>What this test shows: the application tier and the web tier can see each other — connectivity across all three tiers, taken with 6.3.</w:t>
       </w:r>
     </w:p>
+    <w:p>
+      <w:pPr>
+        <w:spacing w:after="60"/>
+        <w:ind w:left="340"/>
+      </w:pPr>
+      <w:r>
+        <w:rPr>
+          <w:b/>
+          <w:sz w:val="21"/>
+        </w:rPr>
+        <w:t xml:space="preserve">1.  </w:t>
+      </w:r>
+      <w:r>
+        <w:rPr>
+          <w:sz w:val="21"/>
+        </w:rPr>
+        <w:t>In the AWS console, open EC2 → Load Balancers and copy your load balancer's DNS name.</w:t>
+      </w:r>
+    </w:p>
+    <w:p>
+      <w:pPr>
+        <w:spacing w:after="60"/>
+        <w:ind w:left="340"/>
+      </w:pPr>
+      <w:r>
+        <w:rPr>
+          <w:b/>
+          <w:sz w:val="21"/>
+        </w:rPr>
+        <w:t xml:space="preserve">2.  </w:t>
+      </w:r>
+      <w:r>
+        <w:rPr>
+          <w:sz w:val="21"/>
+        </w:rPr>
+        <w:t>In the session from 6.1, run: curl -I http://&lt;your-load-balancer-dns-name&gt;</w:t>
+      </w:r>
+    </w:p>
+    <w:p>
+      <w:pPr>
+        <w:spacing w:after="60"/>
+        <w:ind w:left="340"/>
+      </w:pPr>
+      <w:r>
+        <w:rPr>
+          <w:b/>
+          <w:sz w:val="21"/>
+        </w:rPr>
+        <w:t xml:space="preserve">3.  </w:t>
+      </w:r>
+      <w:r>
+        <w:rPr>
+          <w:sz w:val="21"/>
+        </w:rPr>
+        <w:t>Confirm an HTTP status line comes back.</w:t>
+      </w:r>
+    </w:p>
+    <w:p/>
+    <w:tbl>
+      <w:tblPr>
+        <w:tblW w:type="auto" w:w="0"/>
+        <w:tblLook w:firstColumn="1" w:firstRow="1" w:lastColumn="0" w:lastRow="0" w:noHBand="0" w:noVBand="1" w:val="04A0"/>
+      </w:tblPr>
+      <w:tblGrid>
+        <w:gridCol w:w="9412"/>
+      </w:tblGrid>
+      <w:tr>
+        <w:tc>
+          <w:tcPr>
+            <w:tcW w:type="dxa" w:w="9411"/>
+            <w:tcBorders>
+              <w:top w:val="single" w:sz="4" w:space="0" w:color="E4DED3"/>
+              <w:left w:val="single" w:sz="4" w:space="0" w:color="E4DED3"/>
+              <w:bottom w:val="single" w:sz="4" w:space="0" w:color="E4DED3"/>
+              <w:right w:val="single" w:sz="4" w:space="0" w:color="E4DED3"/>
+            </w:tcBorders>
+            <w:shd w:val="clear" w:color="auto" w:fill="F8F4ED"/>
+          </w:tcPr>
+          <w:p>
+            <w:pPr>
+              <w:jc w:val="center"/>
+            </w:pPr>
+            <w:r>
+              <w:rPr>
+                <w:b/>
+                <w:sz w:val="20"/>
+              </w:rPr>
+              <w:t>[ PASTE YOUR SCREENSHOT HERE ]</w:t>
+            </w:r>
+          </w:p>
+          <w:p>
+            <w:pPr>
+              <w:jc w:val="center"/>
+            </w:pPr>
+            <w:r>
+              <w:rPr>
+                <w:i/>
+                <w:color w:val="6B6660"/>
+                <w:sz w:val="18"/>
+              </w:rPr>
+              <w:t>the command and the HTTP response from the load balancer.</w:t>
+            </w:r>
+          </w:p>
+        </w:tc>
+      </w:tr>
+    </w:tbl>
+    <w:p/>
+    <w:p>
+      <w:pPr>
+        <w:pStyle w:val="Heading3"/>
+      </w:pPr>
+      <w:r>
+        <w:t>6.5 Automatic scaling</w:t>
+      </w:r>
+    </w:p>
+    <w:p>
+      <w:pPr>
+        <w:spacing w:after="120"/>
+      </w:pPr>
+      <w:r>
+        <w:rPr>
+          <w:i/>
+          <w:color w:val="6B6660"/>
+          <w:sz w:val="19"/>
+        </w:rPr>
+        <w:t>What this test shows: the Auto Scaling group adds and removes instances on its own, without you touching the instance count.</w:t>
+      </w:r>
+    </w:p>
+    <w:p>
+      <w:pPr>
+        <w:spacing w:after="60"/>
+        <w:ind w:left="340"/>
+      </w:pPr>
+      <w:r>
+        <w:rPr>
+          <w:b/>
+          <w:sz w:val="21"/>
+        </w:rPr>
+        <w:t xml:space="preserve">1.  </w:t>
+      </w:r>
+      <w:r>
+        <w:rPr>
+          <w:sz w:val="21"/>
+        </w:rPr>
+        <w:t>In the AWS console, open EC2 → Auto Scaling Groups and select your group.</w:t>
+      </w:r>
+    </w:p>
+    <w:p>
+      <w:pPr>
+        <w:spacing w:after="60"/>
+        <w:ind w:left="340"/>
+      </w:pPr>
+      <w:r>
+        <w:rPr>
+          <w:b/>
+          <w:sz w:val="21"/>
+        </w:rPr>
+        <w:t xml:space="preserve">2.  </w:t>
+      </w:r>
+      <w:r>
+        <w:rPr>
+          <w:sz w:val="21"/>
+        </w:rPr>
+        <w:t>On the Automatic scaling tab, edit your scaling policy and lower the target value far enough that current usage is above it (for example, to 10).</w:t>
+      </w:r>
+    </w:p>
+    <w:p>
+      <w:pPr>
+        <w:spacing w:after="60"/>
+        <w:ind w:left="340"/>
+      </w:pPr>
+      <w:r>
+        <w:rPr>
+          <w:b/>
+          <w:sz w:val="21"/>
+        </w:rPr>
+        <w:t xml:space="preserve">3.  </w:t>
+      </w:r>
+      <w:r>
+        <w:rPr>
+          <w:sz w:val="21"/>
+        </w:rPr>
+        <w:t>Wait for the alarm to trigger. On the Activity tab, watch for a new instance to launch.</w:t>
+      </w:r>
+    </w:p>
+    <w:p>
+      <w:pPr>
+        <w:spacing w:after="60"/>
+        <w:ind w:left="340"/>
+      </w:pPr>
+      <w:r>
+        <w:rPr>
+          <w:b/>
+          <w:sz w:val="21"/>
+        </w:rPr>
+        <w:t xml:space="preserve">4.  </w:t>
+      </w:r>
+      <w:r>
+        <w:rPr>
+          <w:sz w:val="21"/>
+        </w:rPr>
+        <w:t>Once the new instance is in service, edit the policy again and raise the target value well above current usage (for example, to 90).</w:t>
+      </w:r>
+    </w:p>
+    <w:p>
+      <w:pPr>
+        <w:spacing w:after="60"/>
+        <w:ind w:left="340"/>
+      </w:pPr>
+      <w:r>
+        <w:rPr>
+          <w:b/>
+          <w:sz w:val="21"/>
+        </w:rPr>
+        <w:t xml:space="preserve">5.  </w:t>
+      </w:r>
+      <w:r>
+        <w:rPr>
+          <w:sz w:val="21"/>
+        </w:rPr>
+        <w:t>Wait for the group to scale back in, then return the target to the value you set in §5.</w:t>
+      </w:r>
+    </w:p>
+    <w:p/>
+    <w:tbl>
+      <w:tblPr>
+        <w:tblW w:type="auto" w:w="0"/>
+        <w:tblLook w:firstColumn="1" w:firstRow="1" w:lastColumn="0" w:lastRow="0" w:noHBand="0" w:noVBand="1" w:val="04A0"/>
+      </w:tblPr>
+      <w:tblGrid>
+        <w:gridCol w:w="9412"/>
+      </w:tblGrid>
+      <w:tr>
+        <w:tc>
+          <w:tcPr>
+            <w:tcW w:type="dxa" w:w="9411"/>
+            <w:tcBorders>
+              <w:top w:val="single" w:sz="4" w:space="0" w:color="E4DED3"/>
+              <w:left w:val="single" w:sz="4" w:space="0" w:color="E4DED3"/>
+              <w:bottom w:val="single" w:sz="4" w:space="0" w:color="E4DED3"/>
+              <w:right w:val="single" w:sz="4" w:space="0" w:color="E4DED3"/>
+            </w:tcBorders>
+            <w:shd w:val="clear" w:color="auto" w:fill="F8F4ED"/>
+          </w:tcPr>
+          <w:p>
+            <w:pPr>
+              <w:jc w:val="center"/>
+            </w:pPr>
+            <w:r>
+              <w:rPr>
+                <w:b/>
+                <w:sz w:val="20"/>
+              </w:rPr>
+              <w:t>[ PASTE YOUR SCREENSHOT HERE ]</w:t>
+            </w:r>
+          </w:p>
+          <w:p>
+            <w:pPr>
+              <w:jc w:val="center"/>
+            </w:pPr>
+            <w:r>
+              <w:rPr>
+                <w:i/>
+                <w:color w:val="6B6660"/>
+                <w:sz w:val="18"/>
+              </w:rPr>
+              <w:t>the Activity tab, showing both the scale-out and the scale-in entries with their timestamps.</w:t>
+            </w:r>
+          </w:p>
+        </w:tc>
+      </w:tr>
+    </w:tbl>
+    <w:p/>
     <w:p>
       <w:pPr>
         <w:pStyle w:val="Heading1"/>
@@ -2659,7 +2478,7 @@
               <w:rPr>
                 <w:sz w:val="19"/>
               </w:rPr>
-              <w:t>Test evidence (Appendix C)</w:t>
+              <w:t>Test evidence (§6)</w:t>
             </w:r>
           </w:p>
         </w:tc>
@@ -2836,7 +2655,7 @@
           <w:color w:val="6B6660"/>
           <w:sz w:val="19"/>
         </w:rPr>
-        <w:t>Q6. Identify two points in your deployment where DNS resolution happens (e.g. users reaching the LMS via the ALB; EC2 reaching the RDS endpoint), and explain what would fail for YAT if each were misconfigured</w:t>
+        <w:t>Q6. When a YAT staff member types the LMS address into their browser, DNS resolution has to happen before anything else can. Explain what DNS does at that moment in your deployment, and what would fail for YAT if it were misconfigured.</w:t>
       </w:r>
     </w:p>
     <w:p>
@@ -3397,117 +3216,6 @@
         <w:pStyle w:val="Heading1"/>
       </w:pPr>
       <w:r>
-        <w:t>Appendix C — Test evidence</w:t>
-      </w:r>
-    </w:p>
-    <w:p>
-      <w:pPr>
-        <w:spacing w:after="120"/>
-      </w:pPr>
-      <w:r>
-        <w:rPr>
-          <w:i/>
-          <w:color w:val="6B6660"/>
-          <w:sz w:val="19"/>
-        </w:rPr>
-        <w:t>Attach the evidence supporting the results in §6 — screenshots, terminal/log excerpts and metric graphs.</w:t>
-      </w:r>
-    </w:p>
-    <w:p>
-      <w:r>
-        <w:rPr>
-          <w:i/>
-          <w:color w:val="6B6660"/>
-        </w:rPr>
-        <w:t>[ Test evidence ]</w:t>
-      </w:r>
-    </w:p>
-    <w:p>
-      <w:pPr>
-        <w:pStyle w:val="Heading1"/>
-      </w:pPr>
-      <w:r>
-        <w:t>Appendix D — Reflections</w:t>
-      </w:r>
-    </w:p>
-    <w:p>
-      <w:pPr>
-        <w:spacing w:after="120"/>
-      </w:pPr>
-      <w:r>
-        <w:rPr>
-          <w:i/>
-          <w:color w:val="6B6660"/>
-          <w:sz w:val="19"/>
-        </w:rPr>
-        <w:t>Reflect honestly on your own build — your judgement and experience, not a summary of what you built. Honest "here's what I'd change" earns more credit than "everything went perfectly."</w:t>
-      </w:r>
-    </w:p>
-    <w:p>
-      <w:pPr>
-        <w:pStyle w:val="Heading3"/>
-      </w:pPr>
-      <w:r>
-        <w:t>R1 — Lessons applicable beyond this build.</w:t>
-      </w:r>
-    </w:p>
-    <w:p>
-      <w:pPr>
-        <w:spacing w:after="120"/>
-      </w:pPr>
-      <w:r>
-        <w:rPr>
-          <w:i/>
-          <w:color w:val="6B6660"/>
-          <w:sz w:val="19"/>
-        </w:rPr>
-        <w:t>Describe one lesson from this deployment that you would carry into future cloud work. Say how you arrived at it — what happened during your build that taught it to you — and why it would apply beyond this project.</w:t>
-      </w:r>
-    </w:p>
-    <w:p>
-      <w:r>
-        <w:rPr>
-          <w:i/>
-          <w:color w:val="6B6660"/>
-        </w:rPr>
-        <w:t>[ Write your response here ]</w:t>
-      </w:r>
-    </w:p>
-    <w:p>
-      <w:pPr>
-        <w:pStyle w:val="Heading3"/>
-      </w:pPr>
-      <w:r>
-        <w:t>R2 — Decisions in hindsight.</w:t>
-      </w:r>
-    </w:p>
-    <w:p>
-      <w:pPr>
-        <w:spacing w:after="120"/>
-      </w:pPr>
-      <w:r>
-        <w:rPr>
-          <w:i/>
-          <w:color w:val="6B6660"/>
-          <w:sz w:val="19"/>
-        </w:rPr>
-        <w:t>Looking back over the choices you made, name one decision you'd make the same way again (and why it proved right), and one decision you would revise (what you'd do differently and why).</w:t>
-      </w:r>
-    </w:p>
-    <w:p>
-      <w:r>
-        <w:rPr>
-          <w:i/>
-          <w:color w:val="6B6660"/>
-        </w:rPr>
-        <w:t>[ Write your response here ]</w:t>
-      </w:r>
-    </w:p>
-    <w:p>
-      <w:pPr>
-        <w:pStyle w:val="Heading1"/>
-      </w:pPr>
-      <w:r>
         <w:t>Document control</w:t>
       </w:r>
     </w:p>

</xml_diff>